<commit_message>
feat: stable transport flow and document export improvements, fix status restoration and transport field logic
</commit_message>
<xml_diff>
--- a/public/templates/template_smr.docx
+++ b/public/templates/template_smr.docx
@@ -57,12 +57,6 @@
         <w:gridCol w:w="371"/>
       </w:tblGrid>
       <w:tr>
-        <w:tblPrEx>
-          <w:tblCellMar>
-            <w:top w:w="0" w:type="dxa"/>
-            <w:bottom w:w="0" w:type="dxa"/>
-          </w:tblCellMar>
-        </w:tblPrEx>
         <w:tc>
           <w:tcPr>
             <w:tcW w:w="209" w:type="dxa"/>
@@ -1263,12 +1257,6 @@
         </w:tc>
       </w:tr>
       <w:tr>
-        <w:tblPrEx>
-          <w:tblCellMar>
-            <w:top w:w="0" w:type="dxa"/>
-            <w:bottom w:w="0" w:type="dxa"/>
-          </w:tblCellMar>
-        </w:tblPrEx>
         <w:trPr>
           <w:trHeight w:val="258"/>
         </w:trPr>
@@ -1291,11 +1279,15 @@
               </w:rPr>
             </w:pPr>
             <w:r>
-              <w:rPr>
-                <w:sz w:val="22"/>
-                <w:szCs w:val="22"/>
-              </w:rPr>
-              <w:t>{sender_name}</w:t>
+              <w:t>{</w:t>
+            </w:r>
+            <w:proofErr w:type="spellStart"/>
+            <w:r>
+              <w:t>sender_name</w:t>
+            </w:r>
+            <w:proofErr w:type="spellEnd"/>
+            <w:r>
+              <w:t>}</w:t>
             </w:r>
           </w:p>
         </w:tc>
@@ -1335,12 +1327,6 @@
         </w:tc>
       </w:tr>
       <w:tr>
-        <w:tblPrEx>
-          <w:tblCellMar>
-            <w:top w:w="0" w:type="dxa"/>
-            <w:bottom w:w="0" w:type="dxa"/>
-          </w:tblCellMar>
-        </w:tblPrEx>
         <w:tc>
           <w:tcPr>
             <w:tcW w:w="5385" w:type="dxa"/>
@@ -1360,8 +1346,6 @@
               <w:rPr>
                 <w:rFonts w:eastAsia="Calibri"/>
                 <w:bCs/>
-                <w:sz w:val="22"/>
-                <w:szCs w:val="22"/>
                 <w:lang w:val="en-US" w:eastAsia="en-US"/>
               </w:rPr>
             </w:pPr>
@@ -1369,11 +1353,27 @@
               <w:rPr>
                 <w:rFonts w:eastAsia="Calibri"/>
                 <w:bCs/>
-                <w:sz w:val="22"/>
-                <w:szCs w:val="22"/>
                 <w:lang w:val="en-US" w:eastAsia="en-US"/>
               </w:rPr>
-              <w:t>{sender_address}</w:t>
+              <w:t>{</w:t>
+            </w:r>
+            <w:proofErr w:type="spellStart"/>
+            <w:r>
+              <w:rPr>
+                <w:rFonts w:eastAsia="Calibri"/>
+                <w:bCs/>
+                <w:lang w:val="en-US" w:eastAsia="en-US"/>
+              </w:rPr>
+              <w:t>sender_address</w:t>
+            </w:r>
+            <w:proofErr w:type="spellEnd"/>
+            <w:r>
+              <w:rPr>
+                <w:rFonts w:eastAsia="Calibri"/>
+                <w:bCs/>
+                <w:lang w:val="en-US" w:eastAsia="en-US"/>
+              </w:rPr>
+              <w:t>}</w:t>
             </w:r>
           </w:p>
         </w:tc>
@@ -1401,12 +1401,6 @@
         </w:tc>
       </w:tr>
       <w:tr>
-        <w:tblPrEx>
-          <w:tblCellMar>
-            <w:top w:w="0" w:type="dxa"/>
-            <w:bottom w:w="0" w:type="dxa"/>
-          </w:tblCellMar>
-        </w:tblPrEx>
         <w:tc>
           <w:tcPr>
             <w:tcW w:w="5385" w:type="dxa"/>
@@ -1430,11 +1424,27 @@
               <w:rPr>
                 <w:rFonts w:eastAsia="Calibri"/>
                 <w:bCs/>
-                <w:sz w:val="22"/>
-                <w:szCs w:val="22"/>
                 <w:lang w:eastAsia="en-US"/>
               </w:rPr>
-              <w:t>{sender_bin}</w:t>
+              <w:t>{</w:t>
+            </w:r>
+            <w:proofErr w:type="spellStart"/>
+            <w:r>
+              <w:rPr>
+                <w:rFonts w:eastAsia="Calibri"/>
+                <w:bCs/>
+                <w:lang w:eastAsia="en-US"/>
+              </w:rPr>
+              <w:t>sender_bin</w:t>
+            </w:r>
+            <w:proofErr w:type="spellEnd"/>
+            <w:r>
+              <w:rPr>
+                <w:rFonts w:eastAsia="Calibri"/>
+                <w:bCs/>
+                <w:lang w:eastAsia="en-US"/>
+              </w:rPr>
+              <w:t>}</w:t>
             </w:r>
           </w:p>
         </w:tc>
@@ -1461,12 +1471,6 @@
         </w:tc>
       </w:tr>
       <w:tr>
-        <w:tblPrEx>
-          <w:tblCellMar>
-            <w:top w:w="0" w:type="dxa"/>
-            <w:bottom w:w="0" w:type="dxa"/>
-          </w:tblCellMar>
-        </w:tblPrEx>
         <w:tc>
           <w:tcPr>
             <w:tcW w:w="5385" w:type="dxa"/>
@@ -1498,7 +1502,25 @@
                 <w:szCs w:val="24"/>
                 <w:lang w:val="en-US" w:eastAsia="ru-RU"/>
               </w:rPr>
-              <w:t>{smr_sender}</w:t>
+              <w:t>{</w:t>
+            </w:r>
+            <w:proofErr w:type="spellStart"/>
+            <w:r>
+              <w:rPr>
+                <w:color w:val="000000"/>
+                <w:szCs w:val="24"/>
+                <w:lang w:val="en-US" w:eastAsia="ru-RU"/>
+              </w:rPr>
+              <w:t>smr_sender</w:t>
+            </w:r>
+            <w:proofErr w:type="spellEnd"/>
+            <w:r>
+              <w:rPr>
+                <w:color w:val="000000"/>
+                <w:szCs w:val="24"/>
+                <w:lang w:val="en-US" w:eastAsia="ru-RU"/>
+              </w:rPr>
+              <w:t>}</w:t>
             </w:r>
           </w:p>
         </w:tc>
@@ -1526,12 +1548,6 @@
         </w:tc>
       </w:tr>
       <w:tr>
-        <w:tblPrEx>
-          <w:tblCellMar>
-            <w:top w:w="0" w:type="dxa"/>
-            <w:bottom w:w="0" w:type="dxa"/>
-          </w:tblCellMar>
-        </w:tblPrEx>
         <w:tc>
           <w:tcPr>
             <w:tcW w:w="5385" w:type="dxa"/>
@@ -1584,12 +1600,6 @@
         </w:tc>
       </w:tr>
       <w:tr>
-        <w:tblPrEx>
-          <w:tblCellMar>
-            <w:top w:w="0" w:type="dxa"/>
-            <w:bottom w:w="0" w:type="dxa"/>
-          </w:tblCellMar>
-        </w:tblPrEx>
         <w:tc>
           <w:tcPr>
             <w:tcW w:w="209" w:type="dxa"/>
@@ -1713,6 +1723,7 @@
                 <w:lang w:val="ru-RU"/>
               </w:rPr>
             </w:pPr>
+            <w:proofErr w:type="spellStart"/>
             <w:r>
               <w:rPr>
                 <w:color w:val="FF0000"/>
@@ -1721,6 +1732,7 @@
               </w:rPr>
               <w:t>Empf</w:t>
             </w:r>
+            <w:proofErr w:type="spellEnd"/>
             <w:r>
               <w:rPr>
                 <w:color w:val="FF0000"/>
@@ -1729,6 +1741,7 @@
               </w:rPr>
               <w:t>ä</w:t>
             </w:r>
+            <w:proofErr w:type="spellStart"/>
             <w:r>
               <w:rPr>
                 <w:color w:val="FF0000"/>
@@ -1737,6 +1750,7 @@
               </w:rPr>
               <w:t>nger</w:t>
             </w:r>
+            <w:proofErr w:type="spellEnd"/>
             <w:r>
               <w:rPr>
                 <w:color w:val="FF0000"/>
@@ -1761,6 +1775,7 @@
               </w:rPr>
               <w:t xml:space="preserve">, </w:t>
             </w:r>
+            <w:proofErr w:type="spellStart"/>
             <w:r>
               <w:rPr>
                 <w:color w:val="FF0000"/>
@@ -1769,6 +1784,7 @@
               </w:rPr>
               <w:t>Anschrift</w:t>
             </w:r>
+            <w:proofErr w:type="spellEnd"/>
             <w:r>
               <w:rPr>
                 <w:color w:val="FF0000"/>
@@ -1843,21 +1859,125 @@
                 <w:rFonts w:ascii="Arial CYR" w:hAnsi="Arial CYR"/>
                 <w:color w:val="FF0000"/>
                 <w:sz w:val="11"/>
+                <w:lang w:val="ru-RU"/>
+              </w:rPr>
+            </w:pPr>
+            <w:r>
+              <w:rPr>
+                <w:rFonts w:ascii="Arial CYR" w:hAnsi="Arial CYR"/>
+                <w:color w:val="FF0000"/>
+                <w:sz w:val="11"/>
+                <w:lang w:val="ru-RU"/>
+              </w:rPr>
+              <w:t>Перевозчик</w:t>
+            </w:r>
+            <w:r>
+              <w:rPr>
+                <w:rFonts w:ascii="Arial CYR" w:hAnsi="Arial CYR"/>
+                <w:color w:val="FF0000"/>
+                <w:sz w:val="11"/>
+                <w:lang w:val="ru-RU"/>
+              </w:rPr>
+              <w:t xml:space="preserve"> (</w:t>
+            </w:r>
+            <w:r>
+              <w:rPr>
+                <w:rFonts w:ascii="Arial CYR" w:hAnsi="Arial CYR"/>
+                <w:color w:val="FF0000"/>
+                <w:sz w:val="11"/>
+                <w:lang w:val="ru-RU"/>
+              </w:rPr>
+              <w:t>наименование</w:t>
+            </w:r>
+            <w:r>
+              <w:rPr>
+                <w:rFonts w:ascii="Arial CYR" w:hAnsi="Arial CYR"/>
+                <w:color w:val="FF0000"/>
+                <w:sz w:val="11"/>
+                <w:lang w:val="ru-RU"/>
+              </w:rPr>
+              <w:t xml:space="preserve">, </w:t>
+            </w:r>
+            <w:r>
+              <w:rPr>
+                <w:rFonts w:ascii="Arial CYR" w:hAnsi="Arial CYR"/>
+                <w:color w:val="FF0000"/>
+                <w:sz w:val="11"/>
+                <w:lang w:val="ru-RU"/>
+              </w:rPr>
+              <w:t>адрес</w:t>
+            </w:r>
+            <w:r>
+              <w:rPr>
+                <w:rFonts w:ascii="Arial CYR" w:hAnsi="Arial CYR"/>
+                <w:color w:val="FF0000"/>
+                <w:sz w:val="11"/>
+                <w:lang w:val="ru-RU"/>
+              </w:rPr>
+              <w:t xml:space="preserve">, </w:t>
+            </w:r>
+            <w:r>
+              <w:rPr>
+                <w:rFonts w:ascii="Arial CYR" w:hAnsi="Arial CYR"/>
+                <w:color w:val="FF0000"/>
+                <w:sz w:val="11"/>
+                <w:lang w:val="ru-RU"/>
+              </w:rPr>
+              <w:t>страна</w:t>
+            </w:r>
+            <w:r>
+              <w:rPr>
+                <w:rFonts w:ascii="Arial CYR" w:hAnsi="Arial CYR"/>
+                <w:color w:val="FF0000"/>
+                <w:sz w:val="11"/>
+                <w:lang w:val="ru-RU"/>
+              </w:rPr>
+              <w:t>)</w:t>
+            </w:r>
+          </w:p>
+          <w:p>
+            <w:pPr>
+              <w:rPr>
+                <w:rFonts w:ascii="Arial" w:hAnsi="Arial"/>
+                <w:color w:val="FF0000"/>
+                <w:sz w:val="11"/>
+                <w:lang w:val="ru-RU"/>
+              </w:rPr>
+            </w:pPr>
+            <w:proofErr w:type="spellStart"/>
+            <w:r>
+              <w:rPr>
+                <w:rFonts w:ascii="Arial" w:hAnsi="Arial"/>
+                <w:color w:val="FF0000"/>
+                <w:sz w:val="11"/>
                 <w:lang w:val="en-GB"/>
               </w:rPr>
-            </w:pPr>
-            <w:r>
-              <w:rPr>
-                <w:rFonts w:ascii="Arial CYR" w:hAnsi="Arial CYR"/>
-                <w:color w:val="FF0000"/>
-                <w:sz w:val="11"/>
-                <w:lang w:val="ru-RU"/>
-              </w:rPr>
-              <w:t>Перевозчик</w:t>
-            </w:r>
-            <w:r>
-              <w:rPr>
-                <w:rFonts w:ascii="Arial CYR" w:hAnsi="Arial CYR"/>
+              <w:t>Frachtf</w:t>
+            </w:r>
+            <w:proofErr w:type="spellEnd"/>
+            <w:r>
+              <w:rPr>
+                <w:rFonts w:ascii="Arial" w:hAnsi="Arial"/>
+                <w:color w:val="FF0000"/>
+                <w:sz w:val="11"/>
+                <w:lang w:val="ru-RU"/>
+              </w:rPr>
+              <w:t>ü</w:t>
+            </w:r>
+            <w:proofErr w:type="spellStart"/>
+            <w:r>
+              <w:rPr>
+                <w:rFonts w:ascii="Arial" w:hAnsi="Arial"/>
+                <w:color w:val="FF0000"/>
+                <w:sz w:val="11"/>
+                <w:lang w:val="en-GB"/>
+              </w:rPr>
+              <w:t>hrer</w:t>
+            </w:r>
+            <w:proofErr w:type="spellEnd"/>
+            <w:r>
+              <w:rPr>
+                <w:rFonts w:ascii="Arial" w:hAnsi="Arial"/>
                 <w:color w:val="FF0000"/>
                 <w:sz w:val="11"/>
                 <w:lang w:val="ru-RU"/>
@@ -1866,34 +1986,36 @@
             </w:r>
             <w:r>
               <w:rPr>
-                <w:rFonts w:ascii="Arial CYR" w:hAnsi="Arial CYR"/>
-                <w:color w:val="FF0000"/>
-                <w:sz w:val="11"/>
-                <w:lang w:val="ru-RU"/>
-              </w:rPr>
-              <w:t>наименование</w:t>
-            </w:r>
-            <w:r>
-              <w:rPr>
-                <w:rFonts w:ascii="Arial CYR" w:hAnsi="Arial CYR"/>
+                <w:rFonts w:ascii="Arial" w:hAnsi="Arial"/>
+                <w:color w:val="FF0000"/>
+                <w:sz w:val="11"/>
+                <w:lang w:val="en-GB"/>
+              </w:rPr>
+              <w:t>Name</w:t>
+            </w:r>
+            <w:r>
+              <w:rPr>
+                <w:rFonts w:ascii="Arial" w:hAnsi="Arial"/>
                 <w:color w:val="FF0000"/>
                 <w:sz w:val="11"/>
                 <w:lang w:val="ru-RU"/>
               </w:rPr>
               <w:t xml:space="preserve">, </w:t>
             </w:r>
-            <w:r>
-              <w:rPr>
-                <w:rFonts w:ascii="Arial CYR" w:hAnsi="Arial CYR"/>
-                <w:color w:val="FF0000"/>
-                <w:sz w:val="11"/>
-                <w:lang w:val="ru-RU"/>
-              </w:rPr>
-              <w:t>адрес</w:t>
-            </w:r>
-            <w:r>
-              <w:rPr>
-                <w:rFonts w:ascii="Arial CYR" w:hAnsi="Arial CYR"/>
+            <w:proofErr w:type="spellStart"/>
+            <w:r>
+              <w:rPr>
+                <w:rFonts w:ascii="Arial" w:hAnsi="Arial"/>
+                <w:color w:val="FF0000"/>
+                <w:sz w:val="11"/>
+                <w:lang w:val="en-GB"/>
+              </w:rPr>
+              <w:t>Anschrift</w:t>
+            </w:r>
+            <w:proofErr w:type="spellEnd"/>
+            <w:r>
+              <w:rPr>
+                <w:rFonts w:ascii="Arial" w:hAnsi="Arial"/>
                 <w:color w:val="FF0000"/>
                 <w:sz w:val="11"/>
                 <w:lang w:val="ru-RU"/>
@@ -1902,51 +2024,26 @@
             </w:r>
             <w:r>
               <w:rPr>
-                <w:rFonts w:ascii="Arial CYR" w:hAnsi="Arial CYR"/>
-                <w:color w:val="FF0000"/>
-                <w:sz w:val="11"/>
-                <w:lang w:val="ru-RU"/>
-              </w:rPr>
-              <w:t>страна</w:t>
-            </w:r>
-            <w:r>
-              <w:rPr>
-                <w:rFonts w:ascii="Arial CYR" w:hAnsi="Arial CYR"/>
+                <w:rFonts w:ascii="Arial" w:hAnsi="Arial"/>
                 <w:color w:val="FF0000"/>
                 <w:sz w:val="11"/>
                 <w:lang w:val="en-GB"/>
               </w:rPr>
+              <w:t>Land</w:t>
+            </w:r>
+            <w:r>
+              <w:rPr>
+                <w:rFonts w:ascii="Arial" w:hAnsi="Arial"/>
+                <w:color w:val="FF0000"/>
+                <w:sz w:val="11"/>
+                <w:lang w:val="ru-RU"/>
+              </w:rPr>
               <w:t>)</w:t>
-            </w:r>
-          </w:p>
-          <w:p>
-            <w:pPr>
-              <w:rPr>
-                <w:rFonts w:ascii="Arial" w:hAnsi="Arial"/>
-                <w:color w:val="FF0000"/>
-                <w:sz w:val="11"/>
-                <w:lang w:val="en-GB"/>
-              </w:rPr>
-            </w:pPr>
-            <w:r>
-              <w:rPr>
-                <w:rFonts w:ascii="Arial" w:hAnsi="Arial"/>
-                <w:color w:val="FF0000"/>
-                <w:sz w:val="11"/>
-                <w:lang w:val="en-GB"/>
-              </w:rPr>
-              <w:t>Frachtführer (Name, Anschrift, Land)</w:t>
             </w:r>
           </w:p>
         </w:tc>
       </w:tr>
       <w:tr>
-        <w:tblPrEx>
-          <w:tblCellMar>
-            <w:top w:w="0" w:type="dxa"/>
-            <w:bottom w:w="0" w:type="dxa"/>
-          </w:tblCellMar>
-        </w:tblPrEx>
         <w:tc>
           <w:tcPr>
             <w:tcW w:w="5385" w:type="dxa"/>
@@ -1974,6 +2071,7 @@
               <w:rPr>
                 <w:rFonts w:ascii="Times New Roman" w:hAnsi="Times New Roman"/>
                 <w:b w:val="0"/>
+                <w:sz w:val="20"/>
               </w:rPr>
               <w:t>{receiver_company}</w:t>
             </w:r>
@@ -2001,12 +2099,6 @@
         </w:tc>
       </w:tr>
       <w:tr>
-        <w:tblPrEx>
-          <w:tblCellMar>
-            <w:top w:w="0" w:type="dxa"/>
-            <w:bottom w:w="0" w:type="dxa"/>
-          </w:tblCellMar>
-        </w:tblPrEx>
         <w:tc>
           <w:tcPr>
             <w:tcW w:w="5385" w:type="dxa"/>
@@ -2030,7 +2122,23 @@
                 <w:bCs/>
                 <w:lang w:val="en-US"/>
               </w:rPr>
-              <w:t>{receiver_address}</w:t>
+              <w:t>{</w:t>
+            </w:r>
+            <w:proofErr w:type="spellStart"/>
+            <w:r>
+              <w:rPr>
+                <w:bCs/>
+                <w:lang w:val="en-US"/>
+              </w:rPr>
+              <w:t>receiver_address</w:t>
+            </w:r>
+            <w:proofErr w:type="spellEnd"/>
+            <w:r>
+              <w:rPr>
+                <w:bCs/>
+                <w:lang w:val="en-US"/>
+              </w:rPr>
+              <w:t>}</w:t>
             </w:r>
           </w:p>
         </w:tc>
@@ -2057,12 +2165,6 @@
         </w:tc>
       </w:tr>
       <w:tr>
-        <w:tblPrEx>
-          <w:tblCellMar>
-            <w:top w:w="0" w:type="dxa"/>
-            <w:bottom w:w="0" w:type="dxa"/>
-          </w:tblCellMar>
-        </w:tblPrEx>
         <w:tc>
           <w:tcPr>
             <w:tcW w:w="5385" w:type="dxa"/>
@@ -2087,7 +2189,23 @@
                 <w:bCs/>
                 <w:lang w:val="en-US"/>
               </w:rPr>
-              <w:t>{receiver_bin}</w:t>
+              <w:t>{</w:t>
+            </w:r>
+            <w:proofErr w:type="spellStart"/>
+            <w:r>
+              <w:rPr>
+                <w:bCs/>
+                <w:lang w:val="en-US"/>
+              </w:rPr>
+              <w:t>receiver_bin</w:t>
+            </w:r>
+            <w:proofErr w:type="spellEnd"/>
+            <w:r>
+              <w:rPr>
+                <w:bCs/>
+                <w:lang w:val="en-US"/>
+              </w:rPr>
+              <w:t>}</w:t>
             </w:r>
           </w:p>
         </w:tc>
@@ -2114,12 +2232,6 @@
         </w:tc>
       </w:tr>
       <w:tr>
-        <w:tblPrEx>
-          <w:tblCellMar>
-            <w:top w:w="0" w:type="dxa"/>
-            <w:bottom w:w="0" w:type="dxa"/>
-          </w:tblCellMar>
-        </w:tblPrEx>
         <w:tc>
           <w:tcPr>
             <w:tcW w:w="5385" w:type="dxa"/>
@@ -2143,7 +2255,23 @@
                 <w:bCs/>
                 <w:lang w:val="en-US"/>
               </w:rPr>
-              <w:t>{toCity}</w:t>
+              <w:t>{</w:t>
+            </w:r>
+            <w:proofErr w:type="spellStart"/>
+            <w:r>
+              <w:rPr>
+                <w:bCs/>
+                <w:lang w:val="en-US"/>
+              </w:rPr>
+              <w:t>toCity</w:t>
+            </w:r>
+            <w:proofErr w:type="spellEnd"/>
+            <w:r>
+              <w:rPr>
+                <w:bCs/>
+                <w:lang w:val="en-US"/>
+              </w:rPr>
+              <w:t>}</w:t>
             </w:r>
           </w:p>
         </w:tc>
@@ -2172,12 +2300,6 @@
         </w:tc>
       </w:tr>
       <w:tr>
-        <w:tblPrEx>
-          <w:tblCellMar>
-            <w:top w:w="0" w:type="dxa"/>
-            <w:bottom w:w="0" w:type="dxa"/>
-          </w:tblCellMar>
-        </w:tblPrEx>
         <w:tc>
           <w:tcPr>
             <w:tcW w:w="5385" w:type="dxa"/>
@@ -2226,12 +2348,6 @@
         </w:tc>
       </w:tr>
       <w:tr>
-        <w:tblPrEx>
-          <w:tblCellMar>
-            <w:top w:w="0" w:type="dxa"/>
-            <w:bottom w:w="0" w:type="dxa"/>
-          </w:tblCellMar>
-        </w:tblPrEx>
         <w:tc>
           <w:tcPr>
             <w:tcW w:w="209" w:type="dxa"/>
@@ -2282,6 +2398,7 @@
                 <w:lang w:val="ru-RU"/>
               </w:rPr>
             </w:pPr>
+            <w:proofErr w:type="spellStart"/>
             <w:r>
               <w:rPr>
                 <w:color w:val="FF0000"/>
@@ -2289,6 +2406,7 @@
               </w:rPr>
               <w:t>Место</w:t>
             </w:r>
+            <w:proofErr w:type="spellEnd"/>
             <w:r>
               <w:rPr>
                 <w:color w:val="FF0000"/>
@@ -2297,6 +2415,7 @@
               </w:rPr>
               <w:t xml:space="preserve"> </w:t>
             </w:r>
+            <w:proofErr w:type="spellStart"/>
             <w:r>
               <w:rPr>
                 <w:color w:val="FF0000"/>
@@ -2304,6 +2423,7 @@
               </w:rPr>
               <w:t>разгрузки</w:t>
             </w:r>
+            <w:proofErr w:type="spellEnd"/>
             <w:r>
               <w:rPr>
                 <w:color w:val="FF0000"/>
@@ -2312,6 +2432,7 @@
               </w:rPr>
               <w:t xml:space="preserve"> </w:t>
             </w:r>
+            <w:proofErr w:type="spellStart"/>
             <w:r>
               <w:rPr>
                 <w:color w:val="FF0000"/>
@@ -2319,55 +2440,60 @@
               </w:rPr>
               <w:t>груза</w:t>
             </w:r>
-          </w:p>
-          <w:p>
-            <w:pPr>
+            <w:proofErr w:type="spellEnd"/>
+          </w:p>
+          <w:p>
+            <w:pPr>
+              <w:rPr>
+                <w:color w:val="FF0000"/>
+                <w:sz w:val="11"/>
+                <w:lang w:val="ru-RU"/>
+              </w:rPr>
+            </w:pPr>
+            <w:proofErr w:type="spellStart"/>
+            <w:r>
               <w:rPr>
                 <w:color w:val="FF0000"/>
                 <w:sz w:val="11"/>
                 <w:lang w:val="en-GB"/>
               </w:rPr>
-            </w:pPr>
+              <w:t>Auslieferungsort</w:t>
+            </w:r>
+            <w:proofErr w:type="spellEnd"/>
+            <w:r>
+              <w:rPr>
+                <w:color w:val="FF0000"/>
+                <w:sz w:val="11"/>
+                <w:lang w:val="ru-RU"/>
+              </w:rPr>
+              <w:t xml:space="preserve"> </w:t>
+            </w:r>
             <w:r>
               <w:rPr>
                 <w:color w:val="FF0000"/>
                 <w:sz w:val="11"/>
                 <w:lang w:val="en-GB"/>
               </w:rPr>
-              <w:t>Auslieferungsort</w:t>
-            </w:r>
+              <w:t>des</w:t>
+            </w:r>
+            <w:r>
+              <w:rPr>
+                <w:color w:val="FF0000"/>
+                <w:sz w:val="11"/>
+                <w:lang w:val="ru-RU"/>
+              </w:rPr>
+              <w:t xml:space="preserve"> </w:t>
+            </w:r>
+            <w:proofErr w:type="spellStart"/>
             <w:r>
               <w:rPr>
                 <w:color w:val="FF0000"/>
                 <w:sz w:val="11"/>
                 <w:lang w:val="en-GB"/>
               </w:rPr>
-              <w:t xml:space="preserve"> </w:t>
-            </w:r>
-            <w:r>
-              <w:rPr>
-                <w:color w:val="FF0000"/>
-                <w:sz w:val="11"/>
-                <w:lang w:val="en-GB"/>
-              </w:rPr>
-              <w:t>des</w:t>
-            </w:r>
-            <w:r>
-              <w:rPr>
-                <w:color w:val="FF0000"/>
-                <w:sz w:val="11"/>
-                <w:lang w:val="en-GB"/>
-              </w:rPr>
-              <w:t xml:space="preserve"> </w:t>
-            </w:r>
-            <w:r>
-              <w:rPr>
-                <w:color w:val="FF0000"/>
-                <w:sz w:val="11"/>
-                <w:lang w:val="en-GB"/>
-              </w:rPr>
               <w:t>Gutes</w:t>
             </w:r>
+            <w:proofErr w:type="spellEnd"/>
           </w:p>
         </w:tc>
         <w:tc>
@@ -2418,7 +2544,7 @@
                 <w:rFonts w:ascii="Arial CYR" w:hAnsi="Arial CYR"/>
                 <w:color w:val="FF0000"/>
                 <w:sz w:val="11"/>
-                <w:lang w:val="en-GB"/>
+                <w:lang w:val="ru-RU"/>
               </w:rPr>
             </w:pPr>
             <w:r>
@@ -2435,7 +2561,7 @@
                 <w:rFonts w:ascii="Arial CYR" w:hAnsi="Arial CYR"/>
                 <w:color w:val="FF0000"/>
                 <w:sz w:val="11"/>
-                <w:lang w:val="en-GB"/>
+                <w:lang w:val="ru-RU"/>
               </w:rPr>
               <w:t xml:space="preserve"> </w:t>
             </w:r>
@@ -2453,7 +2579,7 @@
                 <w:rFonts w:ascii="Arial CYR" w:hAnsi="Arial CYR"/>
                 <w:color w:val="FF0000"/>
                 <w:sz w:val="11"/>
-                <w:lang w:val="en-GB"/>
+                <w:lang w:val="ru-RU"/>
               </w:rPr>
               <w:t xml:space="preserve"> (</w:t>
             </w:r>
@@ -2471,7 +2597,7 @@
                 <w:rFonts w:ascii="Arial CYR" w:hAnsi="Arial CYR"/>
                 <w:color w:val="FF0000"/>
                 <w:sz w:val="11"/>
-                <w:lang w:val="en-GB"/>
+                <w:lang w:val="ru-RU"/>
               </w:rPr>
               <w:t xml:space="preserve">, </w:t>
             </w:r>
@@ -2489,7 +2615,7 @@
                 <w:rFonts w:ascii="Arial CYR" w:hAnsi="Arial CYR"/>
                 <w:color w:val="FF0000"/>
                 <w:sz w:val="11"/>
-                <w:lang w:val="en-GB"/>
+                <w:lang w:val="ru-RU"/>
               </w:rPr>
               <w:t xml:space="preserve">, </w:t>
             </w:r>
@@ -2507,7 +2633,7 @@
                 <w:rFonts w:ascii="Arial CYR" w:hAnsi="Arial CYR"/>
                 <w:color w:val="FF0000"/>
                 <w:sz w:val="11"/>
-                <w:lang w:val="en-GB"/>
+                <w:lang w:val="ru-RU"/>
               </w:rPr>
               <w:t>)</w:t>
             </w:r>
@@ -2532,12 +2658,6 @@
         </w:tc>
       </w:tr>
       <w:tr>
-        <w:tblPrEx>
-          <w:tblCellMar>
-            <w:top w:w="0" w:type="dxa"/>
-            <w:bottom w:w="0" w:type="dxa"/>
-          </w:tblCellMar>
-        </w:tblPrEx>
         <w:tc>
           <w:tcPr>
             <w:tcW w:w="921" w:type="dxa"/>
@@ -2571,7 +2691,23 @@
                 <w:color w:val="FF0000"/>
                 <w:sz w:val="11"/>
               </w:rPr>
-              <w:t xml:space="preserve">/Or  </w:t>
+              <w:t>/</w:t>
+            </w:r>
+            <w:proofErr w:type="spellStart"/>
+            <w:r>
+              <w:rPr>
+                <w:color w:val="FF0000"/>
+                <w:sz w:val="11"/>
+              </w:rPr>
+              <w:t>Or</w:t>
+            </w:r>
+            <w:proofErr w:type="spellEnd"/>
+            <w:r>
+              <w:rPr>
+                <w:color w:val="FF0000"/>
+                <w:sz w:val="11"/>
+              </w:rPr>
+              <w:t xml:space="preserve">  </w:t>
             </w:r>
             <w:r>
               <w:rPr>
@@ -2625,12 +2761,6 @@
         </w:tc>
       </w:tr>
       <w:tr>
-        <w:tblPrEx>
-          <w:tblCellMar>
-            <w:top w:w="0" w:type="dxa"/>
-            <w:bottom w:w="0" w:type="dxa"/>
-          </w:tblCellMar>
-        </w:tblPrEx>
         <w:tc>
           <w:tcPr>
             <w:tcW w:w="921" w:type="dxa"/>
@@ -2686,7 +2816,15 @@
               </w:rPr>
             </w:pPr>
             <w:r>
-              <w:t>{smr_unloading}</w:t>
+              <w:t>{</w:t>
+            </w:r>
+            <w:proofErr w:type="spellStart"/>
+            <w:r>
+              <w:t>smr_unloading</w:t>
+            </w:r>
+            <w:proofErr w:type="spellEnd"/>
+            <w:r>
+              <w:t>}</w:t>
             </w:r>
           </w:p>
         </w:tc>
@@ -2713,12 +2851,6 @@
         </w:tc>
       </w:tr>
       <w:tr>
-        <w:tblPrEx>
-          <w:tblCellMar>
-            <w:top w:w="0" w:type="dxa"/>
-            <w:bottom w:w="0" w:type="dxa"/>
-          </w:tblCellMar>
-        </w:tblPrEx>
         <w:tc>
           <w:tcPr>
             <w:tcW w:w="5385" w:type="dxa"/>
@@ -2772,12 +2904,6 @@
         </w:tc>
       </w:tr>
       <w:tr>
-        <w:tblPrEx>
-          <w:tblCellMar>
-            <w:top w:w="0" w:type="dxa"/>
-            <w:bottom w:w="0" w:type="dxa"/>
-          </w:tblCellMar>
-        </w:tblPrEx>
         <w:tc>
           <w:tcPr>
             <w:tcW w:w="209" w:type="dxa"/>
@@ -2931,12 +3057,6 @@
         </w:tc>
       </w:tr>
       <w:tr>
-        <w:tblPrEx>
-          <w:tblCellMar>
-            <w:top w:w="0" w:type="dxa"/>
-            <w:bottom w:w="0" w:type="dxa"/>
-          </w:tblCellMar>
-        </w:tblPrEx>
         <w:tc>
           <w:tcPr>
             <w:tcW w:w="914" w:type="dxa"/>
@@ -3010,7 +3130,27 @@
                 <w:sz w:val="20"/>
                 <w:lang w:val="en-US"/>
               </w:rPr>
-              <w:t>{fromAddress}</w:t>
+              <w:t>{</w:t>
+            </w:r>
+            <w:proofErr w:type="spellStart"/>
+            <w:r>
+              <w:rPr>
+                <w:rFonts w:ascii="Times New Roman" w:hAnsi="Times New Roman"/>
+                <w:b w:val="0"/>
+                <w:sz w:val="20"/>
+                <w:lang w:val="en-US"/>
+              </w:rPr>
+              <w:t>fromAddress</w:t>
+            </w:r>
+            <w:proofErr w:type="spellEnd"/>
+            <w:r>
+              <w:rPr>
+                <w:rFonts w:ascii="Times New Roman" w:hAnsi="Times New Roman"/>
+                <w:b w:val="0"/>
+                <w:sz w:val="20"/>
+                <w:lang w:val="en-US"/>
+              </w:rPr>
+              <w:t>}</w:t>
             </w:r>
           </w:p>
         </w:tc>
@@ -3037,12 +3177,6 @@
         </w:tc>
       </w:tr>
       <w:tr>
-        <w:tblPrEx>
-          <w:tblCellMar>
-            <w:top w:w="0" w:type="dxa"/>
-            <w:bottom w:w="0" w:type="dxa"/>
-          </w:tblCellMar>
-        </w:tblPrEx>
         <w:tc>
           <w:tcPr>
             <w:tcW w:w="914" w:type="dxa"/>
@@ -3105,6 +3239,7 @@
               </w:rPr>
               <w:t>{</w:t>
             </w:r>
+            <w:proofErr w:type="spellStart"/>
             <w:r>
               <w:rPr>
                 <w:bCs/>
@@ -3112,6 +3247,7 @@
               </w:rPr>
               <w:t>fromCity</w:t>
             </w:r>
+            <w:proofErr w:type="spellEnd"/>
             <w:r>
               <w:rPr>
                 <w:bCs/>
@@ -3253,12 +3389,6 @@
         </w:tc>
       </w:tr>
       <w:tr>
-        <w:tblPrEx>
-          <w:tblCellMar>
-            <w:top w:w="0" w:type="dxa"/>
-            <w:bottom w:w="0" w:type="dxa"/>
-          </w:tblCellMar>
-        </w:tblPrEx>
         <w:trPr>
           <w:cantSplit/>
         </w:trPr>
@@ -3319,7 +3449,21 @@
               <w:rPr>
                 <w:lang w:val="en-US"/>
               </w:rPr>
-              <w:t>{dateLong}</w:t>
+              <w:t>{</w:t>
+            </w:r>
+            <w:proofErr w:type="spellStart"/>
+            <w:r>
+              <w:rPr>
+                <w:lang w:val="en-US"/>
+              </w:rPr>
+              <w:t>dateLong</w:t>
+            </w:r>
+            <w:proofErr w:type="spellEnd"/>
+            <w:r>
+              <w:rPr>
+                <w:lang w:val="en-US"/>
+              </w:rPr>
+              <w:t>}</w:t>
             </w:r>
           </w:p>
         </w:tc>
@@ -3346,12 +3490,6 @@
         </w:tc>
       </w:tr>
       <w:tr>
-        <w:tblPrEx>
-          <w:tblCellMar>
-            <w:top w:w="0" w:type="dxa"/>
-            <w:bottom w:w="0" w:type="dxa"/>
-          </w:tblCellMar>
-        </w:tblPrEx>
         <w:trPr>
           <w:cantSplit/>
         </w:trPr>
@@ -3468,12 +3606,6 @@
         </w:tc>
       </w:tr>
       <w:tr>
-        <w:tblPrEx>
-          <w:tblCellMar>
-            <w:top w:w="0" w:type="dxa"/>
-            <w:bottom w:w="0" w:type="dxa"/>
-          </w:tblCellMar>
-        </w:tblPrEx>
         <w:tc>
           <w:tcPr>
             <w:tcW w:w="5385" w:type="dxa"/>
@@ -3521,12 +3653,6 @@
         </w:tc>
       </w:tr>
       <w:tr>
-        <w:tblPrEx>
-          <w:tblCellMar>
-            <w:top w:w="0" w:type="dxa"/>
-            <w:bottom w:w="0" w:type="dxa"/>
-          </w:tblCellMar>
-        </w:tblPrEx>
         <w:tc>
           <w:tcPr>
             <w:tcW w:w="5385" w:type="dxa"/>
@@ -3790,12 +3916,6 @@
         </w:tc>
       </w:tr>
       <w:tr>
-        <w:tblPrEx>
-          <w:tblCellMar>
-            <w:top w:w="0" w:type="dxa"/>
-            <w:bottom w:w="0" w:type="dxa"/>
-          </w:tblCellMar>
-        </w:tblPrEx>
         <w:tc>
           <w:tcPr>
             <w:tcW w:w="209" w:type="dxa"/>
@@ -4121,13 +4241,31 @@
                 <w:sz w:val="11"/>
               </w:rPr>
             </w:pPr>
-            <w:r>
-              <w:rPr>
-                <w:color w:val="FF0000"/>
-                <w:sz w:val="11"/>
-              </w:rPr>
-              <w:t>Наименование груза</w:t>
-            </w:r>
+            <w:proofErr w:type="spellStart"/>
+            <w:r>
+              <w:rPr>
+                <w:color w:val="FF0000"/>
+                <w:sz w:val="11"/>
+              </w:rPr>
+              <w:t>Наименование</w:t>
+            </w:r>
+            <w:proofErr w:type="spellEnd"/>
+            <w:r>
+              <w:rPr>
+                <w:color w:val="FF0000"/>
+                <w:sz w:val="11"/>
+              </w:rPr>
+              <w:t xml:space="preserve"> </w:t>
+            </w:r>
+            <w:proofErr w:type="spellStart"/>
+            <w:r>
+              <w:rPr>
+                <w:color w:val="FF0000"/>
+                <w:sz w:val="11"/>
+              </w:rPr>
+              <w:t>груза</w:t>
+            </w:r>
+            <w:proofErr w:type="spellEnd"/>
           </w:p>
           <w:p>
             <w:pPr>
@@ -4192,13 +4330,23 @@
                 <w:sz w:val="11"/>
               </w:rPr>
             </w:pPr>
+            <w:proofErr w:type="spellStart"/>
             <w:r>
               <w:rPr>
                 <w:rFonts w:ascii="Arial CYR" w:hAnsi="Arial CYR"/>
                 <w:color w:val="FF0000"/>
                 <w:sz w:val="11"/>
               </w:rPr>
-              <w:t>Статист №</w:t>
+              <w:t>Статист</w:t>
+            </w:r>
+            <w:proofErr w:type="spellEnd"/>
+            <w:r>
+              <w:rPr>
+                <w:rFonts w:ascii="Arial CYR" w:hAnsi="Arial CYR"/>
+                <w:color w:val="FF0000"/>
+                <w:sz w:val="11"/>
+              </w:rPr>
+              <w:t xml:space="preserve"> №</w:t>
             </w:r>
           </w:p>
           <w:p>
@@ -4267,14 +4415,52 @@
                 <w:sz w:val="11"/>
               </w:rPr>
             </w:pPr>
+            <w:proofErr w:type="spellStart"/>
             <w:r>
               <w:rPr>
                 <w:rFonts w:ascii="Arial CYR" w:hAnsi="Arial CYR"/>
                 <w:color w:val="FF0000"/>
                 <w:sz w:val="11"/>
               </w:rPr>
-              <w:t>Вес брутто, кг</w:t>
-            </w:r>
+              <w:t>Вес</w:t>
+            </w:r>
+            <w:proofErr w:type="spellEnd"/>
+            <w:r>
+              <w:rPr>
+                <w:rFonts w:ascii="Arial CYR" w:hAnsi="Arial CYR"/>
+                <w:color w:val="FF0000"/>
+                <w:sz w:val="11"/>
+              </w:rPr>
+              <w:t xml:space="preserve"> </w:t>
+            </w:r>
+            <w:proofErr w:type="spellStart"/>
+            <w:r>
+              <w:rPr>
+                <w:rFonts w:ascii="Arial CYR" w:hAnsi="Arial CYR"/>
+                <w:color w:val="FF0000"/>
+                <w:sz w:val="11"/>
+              </w:rPr>
+              <w:t>брутто</w:t>
+            </w:r>
+            <w:proofErr w:type="spellEnd"/>
+            <w:r>
+              <w:rPr>
+                <w:rFonts w:ascii="Arial CYR" w:hAnsi="Arial CYR"/>
+                <w:color w:val="FF0000"/>
+                <w:sz w:val="11"/>
+              </w:rPr>
+              <w:t xml:space="preserve">, </w:t>
+            </w:r>
+            <w:proofErr w:type="spellStart"/>
+            <w:r>
+              <w:rPr>
+                <w:rFonts w:ascii="Arial CYR" w:hAnsi="Arial CYR"/>
+                <w:color w:val="FF0000"/>
+                <w:sz w:val="11"/>
+              </w:rPr>
+              <w:t>кг</w:t>
+            </w:r>
+            <w:proofErr w:type="spellEnd"/>
           </w:p>
           <w:p>
             <w:pPr>
@@ -4284,13 +4470,23 @@
                 <w:sz w:val="11"/>
               </w:rPr>
             </w:pPr>
+            <w:proofErr w:type="spellStart"/>
             <w:r>
               <w:rPr>
                 <w:rFonts w:ascii="Arial" w:hAnsi="Arial"/>
                 <w:color w:val="FF0000"/>
                 <w:sz w:val="11"/>
               </w:rPr>
-              <w:t>Bruttogew., kg</w:t>
+              <w:t>Bruttogew</w:t>
+            </w:r>
+            <w:proofErr w:type="spellEnd"/>
+            <w:r>
+              <w:rPr>
+                <w:rFonts w:ascii="Arial" w:hAnsi="Arial"/>
+                <w:color w:val="FF0000"/>
+                <w:sz w:val="11"/>
+              </w:rPr>
+              <w:t>., kg</w:t>
             </w:r>
           </w:p>
         </w:tc>
@@ -4342,13 +4538,23 @@
                 <w:sz w:val="11"/>
               </w:rPr>
             </w:pPr>
+            <w:proofErr w:type="spellStart"/>
             <w:r>
               <w:rPr>
                 <w:rFonts w:ascii="Arial CYR" w:hAnsi="Arial CYR"/>
                 <w:color w:val="FF0000"/>
                 <w:sz w:val="11"/>
               </w:rPr>
-              <w:t>Объём, м</w:t>
+              <w:t>Объём</w:t>
+            </w:r>
+            <w:proofErr w:type="spellEnd"/>
+            <w:r>
+              <w:rPr>
+                <w:rFonts w:ascii="Arial CYR" w:hAnsi="Arial CYR"/>
+                <w:color w:val="FF0000"/>
+                <w:sz w:val="11"/>
+              </w:rPr>
+              <w:t>, м</w:t>
             </w:r>
             <w:r>
               <w:rPr>
@@ -4379,12 +4585,6 @@
         </w:tc>
       </w:tr>
       <w:tr>
-        <w:tblPrEx>
-          <w:tblCellMar>
-            <w:top w:w="0" w:type="dxa"/>
-            <w:bottom w:w="0" w:type="dxa"/>
-          </w:tblCellMar>
-        </w:tblPrEx>
         <w:tc>
           <w:tcPr>
             <w:tcW w:w="6819" w:type="dxa"/>
@@ -4464,12 +4664,6 @@
         </w:tc>
       </w:tr>
       <w:tr>
-        <w:tblPrEx>
-          <w:tblCellMar>
-            <w:top w:w="0" w:type="dxa"/>
-            <w:bottom w:w="0" w:type="dxa"/>
-          </w:tblCellMar>
-        </w:tblPrEx>
         <w:tc>
           <w:tcPr>
             <w:tcW w:w="6819" w:type="dxa"/>
@@ -4513,9 +4707,8 @@
                 <w:sz w:val="20"/>
                 <w:lang w:val="en-US"/>
               </w:rPr>
-              <w:t>{#</w:t>
-            </w:r>
-            <w:proofErr w:type="gramStart"/>
+              <w:t xml:space="preserve">               </w:t>
+            </w:r>
             <w:r>
               <w:rPr>
                 <w:rFonts w:ascii="Times New Roman" w:hAnsi="Times New Roman"/>
@@ -4524,8 +4717,9 @@
                 <w:sz w:val="20"/>
                 <w:lang w:val="en-US"/>
               </w:rPr>
-              <w:t>rows}</w:t>
-            </w:r>
+              <w:t>{#</w:t>
+            </w:r>
+            <w:proofErr w:type="gramStart"/>
             <w:r>
               <w:rPr>
                 <w:rFonts w:ascii="Times New Roman" w:hAnsi="Times New Roman"/>
@@ -4534,28 +4728,7 @@
                 <w:sz w:val="20"/>
                 <w:lang w:val="en-US"/>
               </w:rPr>
-              <w:t xml:space="preserve"> </w:t>
-            </w:r>
-            <w:r>
-              <w:rPr>
-                <w:rFonts w:ascii="Times New Roman" w:hAnsi="Times New Roman"/>
-                <w:b w:val="0"/>
-                <w:color w:val="000000"/>
-                <w:sz w:val="20"/>
-                <w:lang w:val="ru-RU"/>
-              </w:rPr>
-              <w:t xml:space="preserve">  </w:t>
-            </w:r>
-            <w:proofErr w:type="gramEnd"/>
-            <w:r>
-              <w:rPr>
-                <w:rFonts w:ascii="Times New Roman" w:hAnsi="Times New Roman"/>
-                <w:b w:val="0"/>
-                <w:color w:val="000000"/>
-                <w:sz w:val="20"/>
-                <w:lang w:val="ru-RU"/>
-              </w:rPr>
-              <w:t xml:space="preserve">   </w:t>
+              <w:t>rows}</w:t>
             </w:r>
             <w:r>
               <w:rPr>
@@ -4573,10 +4746,11 @@
                 <w:b w:val="0"/>
                 <w:color w:val="000000"/>
                 <w:sz w:val="20"/>
-                <w:lang w:val="en-US"/>
-              </w:rPr>
-              <w:t>{seats}</w:t>
-            </w:r>
+                <w:lang w:val="ru-RU"/>
+              </w:rPr>
+              <w:t xml:space="preserve">  </w:t>
+            </w:r>
+            <w:proofErr w:type="gramEnd"/>
             <w:r>
               <w:rPr>
                 <w:rFonts w:ascii="Times New Roman" w:hAnsi="Times New Roman"/>
@@ -4585,57 +4759,7 @@
                 <w:sz w:val="20"/>
                 <w:lang w:val="ru-RU"/>
               </w:rPr>
-              <w:t xml:space="preserve">  </w:t>
-            </w:r>
-            <w:r>
-              <w:rPr>
-                <w:rFonts w:ascii="Times New Roman" w:hAnsi="Times New Roman"/>
-                <w:b w:val="0"/>
-                <w:color w:val="000000"/>
-                <w:sz w:val="20"/>
-                <w:lang w:val="ru-RU"/>
-              </w:rPr>
-              <w:t xml:space="preserve"> </w:t>
-            </w:r>
-            <w:r>
-              <w:rPr>
-                <w:rFonts w:ascii="Times New Roman" w:hAnsi="Times New Roman"/>
-                <w:b w:val="0"/>
-                <w:color w:val="000000"/>
-                <w:sz w:val="20"/>
-                <w:lang w:val="ru-RU"/>
-              </w:rPr>
-              <w:t xml:space="preserve"> </w:t>
-            </w:r>
-            <w:r>
-              <w:rPr>
-                <w:rFonts w:ascii="Times New Roman" w:hAnsi="Times New Roman"/>
-                <w:b w:val="0"/>
-                <w:color w:val="000000"/>
-                <w:sz w:val="20"/>
-                <w:lang w:val="ru-RU"/>
-              </w:rPr>
-              <w:t xml:space="preserve">            </w:t>
-            </w:r>
-            <w:r>
-              <w:rPr>
-                <w:rFonts w:ascii="Times New Roman" w:hAnsi="Times New Roman"/>
-                <w:b w:val="0"/>
-                <w:color w:val="000000"/>
-                <w:sz w:val="20"/>
-                <w:lang w:val="ru-RU"/>
-              </w:rPr>
-              <w:t xml:space="preserve"> </w:t>
-            </w:r>
-            <w:r>
-              <w:rPr>
-                <w:rFonts w:ascii="Times New Roman" w:hAnsi="Times New Roman"/>
-                <w:b w:val="0"/>
-                <w:color w:val="000000"/>
-                <w:sz w:val="20"/>
-                <w:lang w:val="ru-RU"/>
-              </w:rPr>
-              <w:t xml:space="preserve">    </w:t>
+              <w:t xml:space="preserve">   </w:t>
             </w:r>
             <w:r>
               <w:rPr>
@@ -4645,27 +4769,7 @@
                 <w:sz w:val="20"/>
                 <w:lang w:val="en-US"/>
               </w:rPr>
-              <w:t>{packaging}</w:t>
-            </w:r>
-            <w:r>
-              <w:rPr>
-                <w:rFonts w:ascii="Times New Roman" w:hAnsi="Times New Roman"/>
-                <w:b w:val="0"/>
-                <w:color w:val="000000"/>
-                <w:sz w:val="20"/>
-                <w:lang w:val="ru-RU"/>
-              </w:rPr>
               <w:t xml:space="preserve"> </w:t>
-            </w:r>
-            <w:r>
-              <w:rPr>
-                <w:rFonts w:ascii="Times New Roman" w:hAnsi="Times New Roman"/>
-                <w:b w:val="0"/>
-                <w:color w:val="000000"/>
-                <w:sz w:val="20"/>
-                <w:lang w:val="ru-RU"/>
-              </w:rPr>
-              <w:t xml:space="preserve">       </w:t>
             </w:r>
             <w:r>
               <w:rPr>
@@ -4675,6 +4779,106 @@
                 <w:sz w:val="20"/>
                 <w:lang w:val="en-US"/>
               </w:rPr>
+              <w:t>{seats}</w:t>
+            </w:r>
+            <w:r>
+              <w:rPr>
+                <w:rFonts w:ascii="Times New Roman" w:hAnsi="Times New Roman"/>
+                <w:b w:val="0"/>
+                <w:color w:val="000000"/>
+                <w:sz w:val="20"/>
+                <w:lang w:val="ru-RU"/>
+              </w:rPr>
+              <w:t xml:space="preserve">  </w:t>
+            </w:r>
+            <w:r>
+              <w:rPr>
+                <w:rFonts w:ascii="Times New Roman" w:hAnsi="Times New Roman"/>
+                <w:b w:val="0"/>
+                <w:color w:val="000000"/>
+                <w:sz w:val="20"/>
+                <w:lang w:val="ru-RU"/>
+              </w:rPr>
+              <w:t xml:space="preserve"> </w:t>
+            </w:r>
+            <w:r>
+              <w:rPr>
+                <w:rFonts w:ascii="Times New Roman" w:hAnsi="Times New Roman"/>
+                <w:b w:val="0"/>
+                <w:color w:val="000000"/>
+                <w:sz w:val="20"/>
+                <w:lang w:val="ru-RU"/>
+              </w:rPr>
+              <w:t xml:space="preserve"> </w:t>
+            </w:r>
+            <w:r>
+              <w:rPr>
+                <w:rFonts w:ascii="Times New Roman" w:hAnsi="Times New Roman"/>
+                <w:b w:val="0"/>
+                <w:color w:val="000000"/>
+                <w:sz w:val="20"/>
+                <w:lang w:val="ru-RU"/>
+              </w:rPr>
+              <w:t xml:space="preserve">            </w:t>
+            </w:r>
+            <w:r>
+              <w:rPr>
+                <w:rFonts w:ascii="Times New Roman" w:hAnsi="Times New Roman"/>
+                <w:b w:val="0"/>
+                <w:color w:val="000000"/>
+                <w:sz w:val="20"/>
+                <w:lang w:val="ru-RU"/>
+              </w:rPr>
+              <w:t xml:space="preserve"> </w:t>
+            </w:r>
+            <w:r>
+              <w:rPr>
+                <w:rFonts w:ascii="Times New Roman" w:hAnsi="Times New Roman"/>
+                <w:b w:val="0"/>
+                <w:color w:val="000000"/>
+                <w:sz w:val="20"/>
+                <w:lang w:val="ru-RU"/>
+              </w:rPr>
+              <w:t xml:space="preserve">    </w:t>
+            </w:r>
+            <w:r>
+              <w:rPr>
+                <w:rFonts w:ascii="Times New Roman" w:hAnsi="Times New Roman"/>
+                <w:b w:val="0"/>
+                <w:color w:val="000000"/>
+                <w:sz w:val="20"/>
+                <w:lang w:val="en-US"/>
+              </w:rPr>
+              <w:t>{packaging}</w:t>
+            </w:r>
+            <w:r>
+              <w:rPr>
+                <w:rFonts w:ascii="Times New Roman" w:hAnsi="Times New Roman"/>
+                <w:b w:val="0"/>
+                <w:color w:val="000000"/>
+                <w:sz w:val="20"/>
+                <w:lang w:val="ru-RU"/>
+              </w:rPr>
+              <w:t xml:space="preserve"> </w:t>
+            </w:r>
+            <w:r>
+              <w:rPr>
+                <w:rFonts w:ascii="Times New Roman" w:hAnsi="Times New Roman"/>
+                <w:b w:val="0"/>
+                <w:color w:val="000000"/>
+                <w:sz w:val="20"/>
+                <w:lang w:val="ru-RU"/>
+              </w:rPr>
+              <w:t xml:space="preserve">       </w:t>
+            </w:r>
+            <w:r>
+              <w:rPr>
+                <w:rFonts w:ascii="Times New Roman" w:hAnsi="Times New Roman"/>
+                <w:b w:val="0"/>
+                <w:color w:val="000000"/>
+                <w:sz w:val="20"/>
+                <w:lang w:val="en-US"/>
+              </w:rPr>
               <w:t>{title}</w:t>
             </w:r>
           </w:p>
@@ -4789,12 +4993,6 @@
         </w:tc>
       </w:tr>
       <w:tr>
-        <w:tblPrEx>
-          <w:tblCellMar>
-            <w:top w:w="0" w:type="dxa"/>
-            <w:bottom w:w="0" w:type="dxa"/>
-          </w:tblCellMar>
-        </w:tblPrEx>
         <w:tc>
           <w:tcPr>
             <w:tcW w:w="6819" w:type="dxa"/>
@@ -4877,12 +5075,6 @@
         </w:tc>
       </w:tr>
       <w:tr>
-        <w:tblPrEx>
-          <w:tblCellMar>
-            <w:top w:w="0" w:type="dxa"/>
-            <w:bottom w:w="0" w:type="dxa"/>
-          </w:tblCellMar>
-        </w:tblPrEx>
         <w:tc>
           <w:tcPr>
             <w:tcW w:w="6819" w:type="dxa"/>
@@ -4959,12 +5151,6 @@
         </w:tc>
       </w:tr>
       <w:tr>
-        <w:tblPrEx>
-          <w:tblCellMar>
-            <w:top w:w="0" w:type="dxa"/>
-            <w:bottom w:w="0" w:type="dxa"/>
-          </w:tblCellMar>
-        </w:tblPrEx>
         <w:tc>
           <w:tcPr>
             <w:tcW w:w="6819" w:type="dxa"/>
@@ -5042,12 +5228,6 @@
         </w:tc>
       </w:tr>
       <w:tr>
-        <w:tblPrEx>
-          <w:tblCellMar>
-            <w:top w:w="0" w:type="dxa"/>
-            <w:bottom w:w="0" w:type="dxa"/>
-          </w:tblCellMar>
-        </w:tblPrEx>
         <w:tc>
           <w:tcPr>
             <w:tcW w:w="6819" w:type="dxa"/>
@@ -5122,12 +5302,6 @@
         </w:tc>
       </w:tr>
       <w:tr>
-        <w:tblPrEx>
-          <w:tblCellMar>
-            <w:top w:w="0" w:type="dxa"/>
-            <w:bottom w:w="0" w:type="dxa"/>
-          </w:tblCellMar>
-        </w:tblPrEx>
         <w:tc>
           <w:tcPr>
             <w:tcW w:w="6819" w:type="dxa"/>
@@ -5195,12 +5369,6 @@
         </w:tc>
       </w:tr>
       <w:tr>
-        <w:tblPrEx>
-          <w:tblCellMar>
-            <w:top w:w="0" w:type="dxa"/>
-            <w:bottom w:w="0" w:type="dxa"/>
-          </w:tblCellMar>
-        </w:tblPrEx>
         <w:tc>
           <w:tcPr>
             <w:tcW w:w="1699" w:type="dxa"/>
@@ -5445,12 +5613,6 @@
         </w:tc>
       </w:tr>
       <w:tr>
-        <w:tblPrEx>
-          <w:tblCellMar>
-            <w:top w:w="0" w:type="dxa"/>
-            <w:bottom w:w="0" w:type="dxa"/>
-          </w:tblCellMar>
-        </w:tblPrEx>
         <w:tc>
           <w:tcPr>
             <w:tcW w:w="490" w:type="dxa"/>
@@ -5616,14 +5778,34 @@
                 <w:sz w:val="11"/>
               </w:rPr>
             </w:pPr>
+            <w:proofErr w:type="spellStart"/>
             <w:r>
               <w:rPr>
                 <w:rFonts w:ascii="Arial CYR" w:hAnsi="Arial CYR"/>
                 <w:color w:val="FF0000"/>
                 <w:sz w:val="11"/>
               </w:rPr>
-              <w:t>Подлежит оплате</w:t>
-            </w:r>
+              <w:t>Подлежит</w:t>
+            </w:r>
+            <w:proofErr w:type="spellEnd"/>
+            <w:r>
+              <w:rPr>
+                <w:rFonts w:ascii="Arial CYR" w:hAnsi="Arial CYR"/>
+                <w:color w:val="FF0000"/>
+                <w:sz w:val="11"/>
+              </w:rPr>
+              <w:t xml:space="preserve"> </w:t>
+            </w:r>
+            <w:proofErr w:type="spellStart"/>
+            <w:r>
+              <w:rPr>
+                <w:rFonts w:ascii="Arial CYR" w:hAnsi="Arial CYR"/>
+                <w:color w:val="FF0000"/>
+                <w:sz w:val="11"/>
+              </w:rPr>
+              <w:t>оплате</w:t>
+            </w:r>
+            <w:proofErr w:type="spellEnd"/>
           </w:p>
           <w:p>
             <w:pPr>
@@ -5801,12 +5983,6 @@
         </w:tc>
       </w:tr>
       <w:tr>
-        <w:tblPrEx>
-          <w:tblCellMar>
-            <w:top w:w="0" w:type="dxa"/>
-            <w:bottom w:w="0" w:type="dxa"/>
-          </w:tblCellMar>
-        </w:tblPrEx>
         <w:tc>
           <w:tcPr>
             <w:tcW w:w="5166" w:type="dxa"/>
@@ -6007,12 +6183,6 @@
         </w:tc>
       </w:tr>
       <w:tr>
-        <w:tblPrEx>
-          <w:tblCellMar>
-            <w:top w:w="0" w:type="dxa"/>
-            <w:bottom w:w="0" w:type="dxa"/>
-          </w:tblCellMar>
-        </w:tblPrEx>
         <w:tc>
           <w:tcPr>
             <w:tcW w:w="5166" w:type="dxa"/>
@@ -6220,12 +6390,6 @@
         </w:tc>
       </w:tr>
       <w:tr>
-        <w:tblPrEx>
-          <w:tblCellMar>
-            <w:top w:w="0" w:type="dxa"/>
-            <w:bottom w:w="0" w:type="dxa"/>
-          </w:tblCellMar>
-        </w:tblPrEx>
         <w:tc>
           <w:tcPr>
             <w:tcW w:w="5166" w:type="dxa"/>
@@ -6426,12 +6590,6 @@
         </w:tc>
       </w:tr>
       <w:tr>
-        <w:tblPrEx>
-          <w:tblCellMar>
-            <w:top w:w="0" w:type="dxa"/>
-            <w:bottom w:w="0" w:type="dxa"/>
-          </w:tblCellMar>
-        </w:tblPrEx>
         <w:tc>
           <w:tcPr>
             <w:tcW w:w="5166" w:type="dxa"/>
@@ -6631,12 +6789,6 @@
         </w:tc>
       </w:tr>
       <w:tr>
-        <w:tblPrEx>
-          <w:tblCellMar>
-            <w:top w:w="0" w:type="dxa"/>
-            <w:bottom w:w="0" w:type="dxa"/>
-          </w:tblCellMar>
-        </w:tblPrEx>
         <w:tc>
           <w:tcPr>
             <w:tcW w:w="5166" w:type="dxa"/>
@@ -6836,12 +6988,6 @@
         </w:tc>
       </w:tr>
       <w:tr>
-        <w:tblPrEx>
-          <w:tblCellMar>
-            <w:top w:w="0" w:type="dxa"/>
-            <w:bottom w:w="0" w:type="dxa"/>
-          </w:tblCellMar>
-        </w:tblPrEx>
         <w:tc>
           <w:tcPr>
             <w:tcW w:w="5166" w:type="dxa"/>
@@ -7040,12 +7186,6 @@
         </w:tc>
       </w:tr>
       <w:tr>
-        <w:tblPrEx>
-          <w:tblCellMar>
-            <w:top w:w="0" w:type="dxa"/>
-            <w:bottom w:w="0" w:type="dxa"/>
-          </w:tblCellMar>
-        </w:tblPrEx>
         <w:tc>
           <w:tcPr>
             <w:tcW w:w="5166" w:type="dxa"/>
@@ -7253,12 +7393,6 @@
         </w:tc>
       </w:tr>
       <w:tr>
-        <w:tblPrEx>
-          <w:tblCellMar>
-            <w:top w:w="0" w:type="dxa"/>
-            <w:bottom w:w="0" w:type="dxa"/>
-          </w:tblCellMar>
-        </w:tblPrEx>
         <w:tc>
           <w:tcPr>
             <w:tcW w:w="490" w:type="dxa"/>
@@ -7399,12 +7533,6 @@
         </w:tc>
       </w:tr>
       <w:tr>
-        <w:tblPrEx>
-          <w:tblCellMar>
-            <w:top w:w="0" w:type="dxa"/>
-            <w:bottom w:w="0" w:type="dxa"/>
-          </w:tblCellMar>
-        </w:tblPrEx>
         <w:tc>
           <w:tcPr>
             <w:tcW w:w="490" w:type="dxa"/>
@@ -7603,12 +7731,6 @@
         </w:tc>
       </w:tr>
       <w:tr>
-        <w:tblPrEx>
-          <w:tblCellMar>
-            <w:top w:w="0" w:type="dxa"/>
-            <w:bottom w:w="0" w:type="dxa"/>
-          </w:tblCellMar>
-        </w:tblPrEx>
         <w:tc>
           <w:tcPr>
             <w:tcW w:w="914" w:type="dxa"/>
@@ -7695,12 +7817,6 @@
         </w:tc>
       </w:tr>
       <w:tr>
-        <w:tblPrEx>
-          <w:tblCellMar>
-            <w:top w:w="0" w:type="dxa"/>
-            <w:bottom w:w="0" w:type="dxa"/>
-          </w:tblCellMar>
-        </w:tblPrEx>
         <w:tc>
           <w:tcPr>
             <w:tcW w:w="914" w:type="dxa"/>
@@ -7726,6 +7842,7 @@
               </w:rPr>
               <w:t xml:space="preserve"> </w:t>
             </w:r>
+            <w:proofErr w:type="spellStart"/>
             <w:r>
               <w:rPr>
                 <w:color w:val="FF0000"/>
@@ -7734,6 +7851,7 @@
               </w:rPr>
               <w:t>Нефранко</w:t>
             </w:r>
+            <w:proofErr w:type="spellEnd"/>
           </w:p>
           <w:p>
             <w:pPr>
@@ -7804,12 +7922,6 @@
         </w:tc>
       </w:tr>
       <w:tr>
-        <w:tblPrEx>
-          <w:tblCellMar>
-            <w:top w:w="0" w:type="dxa"/>
-            <w:bottom w:w="0" w:type="dxa"/>
-          </w:tblCellMar>
-        </w:tblPrEx>
         <w:tc>
           <w:tcPr>
             <w:tcW w:w="490" w:type="dxa"/>
@@ -7916,7 +8028,21 @@
               <w:rPr>
                 <w:lang w:val="en-US"/>
               </w:rPr>
-              <w:t>{fromCity}</w:t>
+              <w:t>{</w:t>
+            </w:r>
+            <w:proofErr w:type="spellStart"/>
+            <w:r>
+              <w:rPr>
+                <w:lang w:val="en-US"/>
+              </w:rPr>
+              <w:t>fromCity</w:t>
+            </w:r>
+            <w:proofErr w:type="spellEnd"/>
+            <w:r>
+              <w:rPr>
+                <w:lang w:val="en-US"/>
+              </w:rPr>
+              <w:t>}</w:t>
             </w:r>
           </w:p>
         </w:tc>
@@ -7983,7 +8109,21 @@
               <w:rPr>
                 <w:lang w:val="en-US"/>
               </w:rPr>
-              <w:t>{dateLong}</w:t>
+              <w:t>{</w:t>
+            </w:r>
+            <w:proofErr w:type="spellStart"/>
+            <w:r>
+              <w:rPr>
+                <w:lang w:val="en-US"/>
+              </w:rPr>
+              <w:t>dateLong</w:t>
+            </w:r>
+            <w:proofErr w:type="spellEnd"/>
+            <w:r>
+              <w:rPr>
+                <w:lang w:val="en-US"/>
+              </w:rPr>
+              <w:t>}</w:t>
             </w:r>
           </w:p>
         </w:tc>
@@ -8164,12 +8304,6 @@
         </w:tc>
       </w:tr>
       <w:tr>
-        <w:tblPrEx>
-          <w:tblCellMar>
-            <w:top w:w="0" w:type="dxa"/>
-            <w:bottom w:w="0" w:type="dxa"/>
-          </w:tblCellMar>
-        </w:tblPrEx>
         <w:tc>
           <w:tcPr>
             <w:tcW w:w="490" w:type="dxa"/>
@@ -8366,12 +8500,6 @@
         </w:tc>
       </w:tr>
       <w:tr>
-        <w:tblPrEx>
-          <w:tblCellMar>
-            <w:top w:w="0" w:type="dxa"/>
-            <w:bottom w:w="0" w:type="dxa"/>
-          </w:tblCellMar>
-        </w:tblPrEx>
         <w:tc>
           <w:tcPr>
             <w:tcW w:w="3855" w:type="dxa"/>
@@ -8393,22 +8521,80 @@
                 <w:lang w:val="ru-RU"/>
               </w:rPr>
             </w:pPr>
+            <w:proofErr w:type="spellStart"/>
             <w:r>
               <w:rPr>
                 <w:color w:val="FF0000"/>
                 <w:sz w:val="11"/>
                 <w:szCs w:val="11"/>
               </w:rPr>
-              <w:t>Прибытие под погрузку</w:t>
-            </w:r>
+              <w:t>Прибытие</w:t>
+            </w:r>
+            <w:proofErr w:type="spellEnd"/>
             <w:r>
               <w:rPr>
                 <w:color w:val="FF0000"/>
                 <w:sz w:val="11"/>
                 <w:szCs w:val="11"/>
-                <w:lang w:val="ru-RU"/>
-              </w:rPr>
-              <w:t xml:space="preserve"> ___________________________час____мин.</w:t>
+              </w:rPr>
+              <w:t xml:space="preserve"> </w:t>
+            </w:r>
+            <w:proofErr w:type="spellStart"/>
+            <w:r>
+              <w:rPr>
+                <w:color w:val="FF0000"/>
+                <w:sz w:val="11"/>
+                <w:szCs w:val="11"/>
+              </w:rPr>
+              <w:t>под</w:t>
+            </w:r>
+            <w:proofErr w:type="spellEnd"/>
+            <w:r>
+              <w:rPr>
+                <w:color w:val="FF0000"/>
+                <w:sz w:val="11"/>
+                <w:szCs w:val="11"/>
+              </w:rPr>
+              <w:t xml:space="preserve"> </w:t>
+            </w:r>
+            <w:proofErr w:type="spellStart"/>
+            <w:r>
+              <w:rPr>
+                <w:color w:val="FF0000"/>
+                <w:sz w:val="11"/>
+                <w:szCs w:val="11"/>
+              </w:rPr>
+              <w:t>погрузку</w:t>
+            </w:r>
+            <w:proofErr w:type="spellEnd"/>
+            <w:r>
+              <w:rPr>
+                <w:color w:val="FF0000"/>
+                <w:sz w:val="11"/>
+                <w:szCs w:val="11"/>
+                <w:lang w:val="ru-RU"/>
+              </w:rPr>
+              <w:t xml:space="preserve"> ___________________________</w:t>
+            </w:r>
+            <w:proofErr w:type="spellStart"/>
+            <w:r>
+              <w:rPr>
+                <w:color w:val="FF0000"/>
+                <w:sz w:val="11"/>
+                <w:szCs w:val="11"/>
+                <w:lang w:val="ru-RU"/>
+              </w:rPr>
+              <w:t>час____мин</w:t>
+            </w:r>
+            <w:proofErr w:type="spellEnd"/>
+            <w:r>
+              <w:rPr>
+                <w:color w:val="FF0000"/>
+                <w:sz w:val="11"/>
+                <w:szCs w:val="11"/>
+                <w:lang w:val="ru-RU"/>
+              </w:rPr>
+              <w:t>.</w:t>
             </w:r>
           </w:p>
           <w:p>
@@ -8423,6 +8609,7 @@
                 <w:lang w:val="en-US"/>
               </w:rPr>
             </w:pPr>
+            <w:proofErr w:type="spellStart"/>
             <w:r>
               <w:rPr>
                 <w:color w:val="FF0000"/>
@@ -8432,6 +8619,7 @@
               </w:rPr>
               <w:t>Ankunft</w:t>
             </w:r>
+            <w:proofErr w:type="spellEnd"/>
             <w:r>
               <w:rPr>
                 <w:color w:val="FF0000"/>
@@ -8474,6 +8662,7 @@
               </w:rPr>
               <w:t xml:space="preserve"> </w:t>
             </w:r>
+            <w:proofErr w:type="spellStart"/>
             <w:r>
               <w:rPr>
                 <w:color w:val="FF0000"/>
@@ -8481,7 +8670,37 @@
                 <w:szCs w:val="11"/>
                 <w:lang w:val="en-US"/>
               </w:rPr>
-              <w:t>Einladung                                                        Uhr.       min.</w:t>
+              <w:t>Einladung</w:t>
+            </w:r>
+            <w:proofErr w:type="spellEnd"/>
+            <w:r>
+              <w:rPr>
+                <w:color w:val="FF0000"/>
+                <w:sz w:val="11"/>
+                <w:szCs w:val="11"/>
+                <w:lang w:val="en-US"/>
+              </w:rPr>
+              <w:t xml:space="preserve">                                                        </w:t>
+            </w:r>
+            <w:proofErr w:type="spellStart"/>
+            <w:r>
+              <w:rPr>
+                <w:color w:val="FF0000"/>
+                <w:sz w:val="11"/>
+                <w:szCs w:val="11"/>
+                <w:lang w:val="en-US"/>
+              </w:rPr>
+              <w:t>Uhr</w:t>
+            </w:r>
+            <w:proofErr w:type="spellEnd"/>
+            <w:r>
+              <w:rPr>
+                <w:color w:val="FF0000"/>
+                <w:sz w:val="11"/>
+                <w:szCs w:val="11"/>
+                <w:lang w:val="en-US"/>
+              </w:rPr>
+              <w:t>.       min.</w:t>
             </w:r>
           </w:p>
           <w:p>
@@ -8590,13 +8809,41 @@
                 <w:lang w:val="ru-RU"/>
               </w:rPr>
             </w:pPr>
+            <w:proofErr w:type="spellStart"/>
             <w:r>
               <w:rPr>
                 <w:color w:val="FF0000"/>
                 <w:sz w:val="11"/>
                 <w:szCs w:val="11"/>
               </w:rPr>
-              <w:t>Путевой лист №________________________</w:t>
+              <w:t>Путевой</w:t>
+            </w:r>
+            <w:proofErr w:type="spellEnd"/>
+            <w:r>
+              <w:rPr>
+                <w:color w:val="FF0000"/>
+                <w:sz w:val="11"/>
+                <w:szCs w:val="11"/>
+              </w:rPr>
+              <w:t xml:space="preserve"> </w:t>
+            </w:r>
+            <w:proofErr w:type="spellStart"/>
+            <w:r>
+              <w:rPr>
+                <w:color w:val="FF0000"/>
+                <w:sz w:val="11"/>
+                <w:szCs w:val="11"/>
+              </w:rPr>
+              <w:t>лист</w:t>
+            </w:r>
+            <w:proofErr w:type="spellEnd"/>
+            <w:r>
+              <w:rPr>
+                <w:color w:val="FF0000"/>
+                <w:sz w:val="11"/>
+                <w:szCs w:val="11"/>
+              </w:rPr>
+              <w:t xml:space="preserve"> №________________________</w:t>
             </w:r>
             <w:r>
               <w:rPr>
@@ -8616,6 +8863,7 @@
               </w:rPr>
               <w:t xml:space="preserve">_______20 </w:t>
             </w:r>
+            <w:proofErr w:type="spellStart"/>
             <w:r>
               <w:rPr>
                 <w:color w:val="FF0000"/>
@@ -8625,6 +8873,7 @@
               </w:rPr>
               <w:t>Uhr</w:t>
             </w:r>
+            <w:proofErr w:type="spellEnd"/>
             <w:r>
               <w:rPr>
                 <w:color w:val="FF0000"/>
@@ -8748,12 +8997,6 @@
         </w:tc>
       </w:tr>
       <w:tr>
-        <w:tblPrEx>
-          <w:tblCellMar>
-            <w:top w:w="0" w:type="dxa"/>
-            <w:bottom w:w="0" w:type="dxa"/>
-          </w:tblCellMar>
-        </w:tblPrEx>
         <w:tc>
           <w:tcPr>
             <w:tcW w:w="3855" w:type="dxa"/>
@@ -8777,7 +9020,7 @@
                 <w:color w:val="FF0000"/>
                 <w:sz w:val="11"/>
                 <w:szCs w:val="11"/>
-                <w:lang w:val="en-US"/>
+                <w:lang w:val="ru-RU"/>
                 <w14:shadow w14:blurRad="50800" w14:dist="38100" w14:dir="2700000" w14:sx="100000" w14:sy="100000" w14:kx="0" w14:ky="0" w14:algn="tl">
                   <w14:srgbClr w14:val="000000">
                     <w14:alpha w14:val="60000"/>
@@ -8819,6 +9062,7 @@
                 <w:lang w:val="ru-RU"/>
               </w:rPr>
             </w:pPr>
+            <w:proofErr w:type="spellStart"/>
             <w:r>
               <w:rPr>
                 <w:color w:val="FF0000"/>
@@ -8827,6 +9071,7 @@
               </w:rPr>
               <w:t>Фамилии</w:t>
             </w:r>
+            <w:proofErr w:type="spellEnd"/>
             <w:r>
               <w:rPr>
                 <w:color w:val="FF0000"/>
@@ -8989,12 +9234,6 @@
         </w:tc>
       </w:tr>
       <w:tr>
-        <w:tblPrEx>
-          <w:tblCellMar>
-            <w:top w:w="0" w:type="dxa"/>
-            <w:bottom w:w="0" w:type="dxa"/>
-          </w:tblCellMar>
-        </w:tblPrEx>
         <w:tc>
           <w:tcPr>
             <w:tcW w:w="3855" w:type="dxa"/>
@@ -9013,7 +9252,7 @@
                 <w:color w:val="FF0000"/>
                 <w:sz w:val="11"/>
                 <w:szCs w:val="11"/>
-                <w:lang w:val="en-US"/>
+                <w:lang w:val="ru-RU"/>
               </w:rPr>
             </w:pPr>
           </w:p>
@@ -9027,33 +9266,64 @@
                 <w:lang w:val="ru-RU"/>
               </w:rPr>
             </w:pPr>
+            <w:proofErr w:type="spellStart"/>
             <w:r>
               <w:rPr>
                 <w:color w:val="FF0000"/>
                 <w:sz w:val="11"/>
                 <w:szCs w:val="11"/>
               </w:rPr>
-              <w:t xml:space="preserve">Убытие                           </w:t>
-            </w:r>
+              <w:t>Убытие</w:t>
+            </w:r>
+            <w:proofErr w:type="spellEnd"/>
             <w:r>
               <w:rPr>
                 <w:color w:val="FF0000"/>
                 <w:sz w:val="11"/>
                 <w:szCs w:val="11"/>
-                <w:lang w:val="ru-RU"/>
-              </w:rPr>
-              <w:t>___________________________час____мин.</w:t>
-            </w:r>
-          </w:p>
-          <w:p>
-            <w:pPr>
+              </w:rPr>
+              <w:t xml:space="preserve">                           </w:t>
+            </w:r>
+            <w:r>
               <w:rPr>
                 <w:color w:val="FF0000"/>
                 <w:sz w:val="11"/>
                 <w:szCs w:val="11"/>
                 <w:lang w:val="ru-RU"/>
               </w:rPr>
-            </w:pPr>
+              <w:t>___________________________</w:t>
+            </w:r>
+            <w:proofErr w:type="spellStart"/>
+            <w:r>
+              <w:rPr>
+                <w:color w:val="FF0000"/>
+                <w:sz w:val="11"/>
+                <w:szCs w:val="11"/>
+                <w:lang w:val="ru-RU"/>
+              </w:rPr>
+              <w:t>час____мин</w:t>
+            </w:r>
+            <w:proofErr w:type="spellEnd"/>
+            <w:r>
+              <w:rPr>
+                <w:color w:val="FF0000"/>
+                <w:sz w:val="11"/>
+                <w:szCs w:val="11"/>
+                <w:lang w:val="ru-RU"/>
+              </w:rPr>
+              <w:t>.</w:t>
+            </w:r>
+          </w:p>
+          <w:p>
+            <w:pPr>
+              <w:rPr>
+                <w:color w:val="FF0000"/>
+                <w:sz w:val="11"/>
+                <w:szCs w:val="11"/>
+                <w:lang w:val="ru-RU"/>
+              </w:rPr>
+            </w:pPr>
+            <w:proofErr w:type="spellStart"/>
             <w:r>
               <w:rPr>
                 <w:color w:val="FF0000"/>
@@ -9061,8 +9331,29 @@
                 <w:szCs w:val="11"/>
                 <w:lang w:val="en-US"/>
               </w:rPr>
-              <w:t>Abfahrt                                                                               Uhr</w:t>
-            </w:r>
+              <w:t>Abfahrt</w:t>
+            </w:r>
+            <w:proofErr w:type="spellEnd"/>
+            <w:r>
+              <w:rPr>
+                <w:color w:val="FF0000"/>
+                <w:sz w:val="11"/>
+                <w:szCs w:val="11"/>
+                <w:lang w:val="ru-RU"/>
+              </w:rPr>
+              <w:t xml:space="preserve">                                                                               </w:t>
+            </w:r>
+            <w:proofErr w:type="spellStart"/>
+            <w:r>
+              <w:rPr>
+                <w:color w:val="FF0000"/>
+                <w:sz w:val="11"/>
+                <w:szCs w:val="11"/>
+                <w:lang w:val="en-US"/>
+              </w:rPr>
+              <w:t>Uhr</w:t>
+            </w:r>
+            <w:proofErr w:type="spellEnd"/>
             <w:r>
               <w:rPr>
                 <w:color w:val="FF0000"/>
@@ -9180,6 +9471,7 @@
                 <w:lang w:val="ru-RU"/>
               </w:rPr>
             </w:pPr>
+            <w:proofErr w:type="spellStart"/>
             <w:r>
               <w:rPr>
                 <w:color w:val="FF0000"/>
@@ -9188,6 +9480,7 @@
               </w:rPr>
               <w:t>Водителей</w:t>
             </w:r>
+            <w:proofErr w:type="spellEnd"/>
             <w:r>
               <w:rPr>
                 <w:color w:val="FF0000"/>
@@ -9252,12 +9545,6 @@
         </w:tc>
       </w:tr>
       <w:tr>
-        <w:tblPrEx>
-          <w:tblCellMar>
-            <w:top w:w="0" w:type="dxa"/>
-            <w:bottom w:w="0" w:type="dxa"/>
-          </w:tblCellMar>
-        </w:tblPrEx>
         <w:tc>
           <w:tcPr>
             <w:tcW w:w="3855" w:type="dxa"/>
@@ -9376,14 +9663,52 @@
                 <w:lang w:val="en-US"/>
               </w:rPr>
             </w:pPr>
+            <w:proofErr w:type="spellStart"/>
             <w:r>
               <w:rPr>
                 <w:color w:val="FF0000"/>
                 <w:sz w:val="11"/>
                 <w:szCs w:val="11"/>
               </w:rPr>
-              <w:t>Подпись и штамп перевозчика</w:t>
-            </w:r>
+              <w:t>Подпись</w:t>
+            </w:r>
+            <w:proofErr w:type="spellEnd"/>
+            <w:r>
+              <w:rPr>
+                <w:color w:val="FF0000"/>
+                <w:sz w:val="11"/>
+                <w:szCs w:val="11"/>
+              </w:rPr>
+              <w:t xml:space="preserve"> и </w:t>
+            </w:r>
+            <w:proofErr w:type="spellStart"/>
+            <w:r>
+              <w:rPr>
+                <w:color w:val="FF0000"/>
+                <w:sz w:val="11"/>
+                <w:szCs w:val="11"/>
+              </w:rPr>
+              <w:t>штамп</w:t>
+            </w:r>
+            <w:proofErr w:type="spellEnd"/>
+            <w:r>
+              <w:rPr>
+                <w:color w:val="FF0000"/>
+                <w:sz w:val="11"/>
+                <w:szCs w:val="11"/>
+              </w:rPr>
+              <w:t xml:space="preserve"> </w:t>
+            </w:r>
+            <w:proofErr w:type="spellStart"/>
+            <w:r>
+              <w:rPr>
+                <w:color w:val="FF0000"/>
+                <w:sz w:val="11"/>
+                <w:szCs w:val="11"/>
+              </w:rPr>
+              <w:t>перевозчика</w:t>
+            </w:r>
+            <w:proofErr w:type="spellEnd"/>
           </w:p>
           <w:p>
             <w:pPr>
@@ -9422,7 +9747,7 @@
                 <w:rFonts w:ascii="Arial" w:hAnsi="Arial"/>
                 <w:color w:val="FF0000"/>
                 <w:sz w:val="11"/>
-                <w:lang w:val="ru-RU"/>
+                <w:lang w:val="en-US"/>
               </w:rPr>
             </w:pPr>
             <w:r>
@@ -9515,12 +9840,6 @@
         </w:tc>
       </w:tr>
       <w:tr>
-        <w:tblPrEx>
-          <w:tblCellMar>
-            <w:top w:w="0" w:type="dxa"/>
-            <w:bottom w:w="0" w:type="dxa"/>
-          </w:tblCellMar>
-        </w:tblPrEx>
         <w:tc>
           <w:tcPr>
             <w:tcW w:w="490" w:type="dxa"/>
@@ -9569,13 +9888,23 @@
                 <w:lang w:val="ru-RU"/>
               </w:rPr>
             </w:pPr>
-            <w:r>
-              <w:rPr>
-                <w:color w:val="FF0000"/>
-                <w:sz w:val="11"/>
-                <w:lang w:val="ru-RU"/>
-              </w:rPr>
-              <w:t>Регистрац. номер/</w:t>
+            <w:proofErr w:type="spellStart"/>
+            <w:r>
+              <w:rPr>
+                <w:color w:val="FF0000"/>
+                <w:sz w:val="11"/>
+                <w:lang w:val="ru-RU"/>
+              </w:rPr>
+              <w:t>Регистрац</w:t>
+            </w:r>
+            <w:proofErr w:type="spellEnd"/>
+            <w:r>
+              <w:rPr>
+                <w:color w:val="FF0000"/>
+                <w:sz w:val="11"/>
+                <w:lang w:val="ru-RU"/>
+              </w:rPr>
+              <w:t>. номер/</w:t>
             </w:r>
             <w:r>
               <w:rPr>
@@ -9768,12 +10097,6 @@
         </w:tc>
       </w:tr>
       <w:tr>
-        <w:tblPrEx>
-          <w:tblCellMar>
-            <w:top w:w="0" w:type="dxa"/>
-            <w:bottom w:w="0" w:type="dxa"/>
-          </w:tblCellMar>
-        </w:tblPrEx>
         <w:tc>
           <w:tcPr>
             <w:tcW w:w="3855" w:type="dxa"/>
@@ -9787,11 +10110,36 @@
           </w:tcPr>
           <w:p>
             <w:pPr>
-              <w:jc w:val="center"/>
               <w:rPr>
                 <w:lang w:val="en-US"/>
               </w:rPr>
             </w:pPr>
+            <w:r>
+              <w:rPr>
+                <w:lang w:val="en-US"/>
+              </w:rPr>
+              <w:t>{</w:t>
+            </w:r>
+            <w:proofErr w:type="spellStart"/>
+            <w:r>
+              <w:rPr>
+                <w:lang w:val="en-US"/>
+              </w:rPr>
+              <w:t>transportType</w:t>
+            </w:r>
+            <w:proofErr w:type="spellEnd"/>
+            <w:r>
+              <w:rPr>
+                <w:lang w:val="en-US"/>
+              </w:rPr>
+              <w:t>}</w:t>
+            </w:r>
+            <w:r>
+              <w:rPr>
+                <w:lang w:val="en-US"/>
+              </w:rPr>
+              <w:t xml:space="preserve"> </w:t>
+            </w:r>
           </w:p>
         </w:tc>
         <w:tc>
@@ -9809,9 +10157,71 @@
             <w:pPr>
               <w:rPr>
                 <w:sz w:val="22"/>
-                <w:lang w:val="ru-RU"/>
-              </w:rPr>
-            </w:pPr>
+                <w:lang w:val="en-US"/>
+              </w:rPr>
+            </w:pPr>
+            <w:r>
+              <w:rPr>
+                <w:szCs w:val="18"/>
+                <w:lang w:val="en-US"/>
+              </w:rPr>
+              <w:t>{#has_</w:t>
+            </w:r>
+            <w:proofErr w:type="gramStart"/>
+            <w:r>
+              <w:rPr>
+                <w:szCs w:val="18"/>
+                <w:lang w:val="en-US"/>
+              </w:rPr>
+              <w:t>trailer}</w:t>
+            </w:r>
+            <w:r>
+              <w:rPr>
+                <w:szCs w:val="18"/>
+                <w:lang w:val="kk-KZ"/>
+              </w:rPr>
+              <w:t>Прицеп</w:t>
+            </w:r>
+            <w:proofErr w:type="gramEnd"/>
+            <w:r>
+              <w:rPr>
+                <w:szCs w:val="18"/>
+                <w:lang w:val="en-US"/>
+              </w:rPr>
+              <w:t>:{</w:t>
+            </w:r>
+            <w:proofErr w:type="spellStart"/>
+            <w:r>
+              <w:rPr>
+                <w:szCs w:val="18"/>
+                <w:lang w:val="en-US"/>
+              </w:rPr>
+              <w:t>trailer_number</w:t>
+            </w:r>
+            <w:proofErr w:type="spellEnd"/>
+            <w:r>
+              <w:rPr>
+                <w:szCs w:val="18"/>
+                <w:lang w:val="en-US"/>
+              </w:rPr>
+              <w:t>}{/</w:t>
+            </w:r>
+            <w:proofErr w:type="spellStart"/>
+            <w:r>
+              <w:rPr>
+                <w:szCs w:val="18"/>
+                <w:lang w:val="en-US"/>
+              </w:rPr>
+              <w:t>has_trailer</w:t>
+            </w:r>
+            <w:proofErr w:type="spellEnd"/>
+            <w:r>
+              <w:rPr>
+                <w:szCs w:val="18"/>
+                <w:lang w:val="en-US"/>
+              </w:rPr>
+              <w:t>}</w:t>
+            </w:r>
           </w:p>
         </w:tc>
         <w:tc>
@@ -9837,12 +10247,6 @@
         </w:tc>
       </w:tr>
       <w:tr>
-        <w:tblPrEx>
-          <w:tblCellMar>
-            <w:top w:w="0" w:type="dxa"/>
-            <w:bottom w:w="0" w:type="dxa"/>
-          </w:tblCellMar>
-        </w:tblPrEx>
         <w:tc>
           <w:tcPr>
             <w:tcW w:w="3855" w:type="dxa"/>
@@ -9856,11 +10260,50 @@
           </w:tcPr>
           <w:p>
             <w:pPr>
-              <w:jc w:val="center"/>
               <w:rPr>
                 <w:b/>
               </w:rPr>
             </w:pPr>
+            <w:r>
+              <w:rPr>
+                <w:bCs/>
+              </w:rPr>
+              <w:t>{</w:t>
+            </w:r>
+            <w:proofErr w:type="spellStart"/>
+            <w:r>
+              <w:rPr>
+                <w:bCs/>
+              </w:rPr>
+              <w:t>vehicle</w:t>
+            </w:r>
+            <w:proofErr w:type="spellEnd"/>
+            <w:r>
+              <w:rPr>
+                <w:bCs/>
+              </w:rPr>
+              <w:t>} {</w:t>
+            </w:r>
+            <w:proofErr w:type="spellStart"/>
+            <w:r>
+              <w:rPr>
+                <w:bCs/>
+              </w:rPr>
+              <w:t>driver</w:t>
+            </w:r>
+            <w:proofErr w:type="spellEnd"/>
+            <w:r>
+              <w:rPr>
+                <w:bCs/>
+              </w:rPr>
+              <w:t>}</w:t>
+            </w:r>
+            <w:r>
+              <w:rPr>
+                <w:b/>
+              </w:rPr>
+              <w:t xml:space="preserve"> </w:t>
+            </w:r>
           </w:p>
         </w:tc>
         <w:tc>
@@ -9879,6 +10322,7 @@
               <w:rPr>
                 <w:color w:val="FF0000"/>
                 <w:sz w:val="22"/>
+                <w:lang w:val="kk-KZ"/>
               </w:rPr>
             </w:pPr>
           </w:p>
@@ -9951,6 +10395,50 @@
     <w:lsdException w:name="Subtitle" w:qFormat="1"/>
     <w:lsdException w:name="Strong" w:qFormat="1"/>
     <w:lsdException w:name="Emphasis" w:qFormat="1"/>
+    <w:lsdException w:name="Normal Table" w:semiHidden="1" w:unhideWhenUsed="1"/>
+    <w:lsdException w:name="Table Simple 1" w:semiHidden="1" w:unhideWhenUsed="1"/>
+    <w:lsdException w:name="Table Simple 2" w:semiHidden="1" w:unhideWhenUsed="1"/>
+    <w:lsdException w:name="Table Simple 3" w:semiHidden="1" w:unhideWhenUsed="1"/>
+    <w:lsdException w:name="Table Classic 1" w:semiHidden="1" w:unhideWhenUsed="1"/>
+    <w:lsdException w:name="Table Classic 2" w:semiHidden="1" w:unhideWhenUsed="1"/>
+    <w:lsdException w:name="Table Classic 3" w:semiHidden="1" w:unhideWhenUsed="1"/>
+    <w:lsdException w:name="Table Classic 4" w:semiHidden="1" w:unhideWhenUsed="1"/>
+    <w:lsdException w:name="Table Colorful 1" w:semiHidden="1" w:unhideWhenUsed="1"/>
+    <w:lsdException w:name="Table Colorful 2" w:semiHidden="1" w:unhideWhenUsed="1"/>
+    <w:lsdException w:name="Table Colorful 3" w:semiHidden="1" w:unhideWhenUsed="1"/>
+    <w:lsdException w:name="Table Columns 1" w:semiHidden="1" w:unhideWhenUsed="1"/>
+    <w:lsdException w:name="Table Columns 2" w:semiHidden="1" w:unhideWhenUsed="1"/>
+    <w:lsdException w:name="Table Columns 3" w:semiHidden="1" w:unhideWhenUsed="1"/>
+    <w:lsdException w:name="Table Columns 4" w:semiHidden="1" w:unhideWhenUsed="1"/>
+    <w:lsdException w:name="Table Columns 5" w:semiHidden="1" w:unhideWhenUsed="1"/>
+    <w:lsdException w:name="Table Grid 1" w:semiHidden="1" w:unhideWhenUsed="1"/>
+    <w:lsdException w:name="Table Grid 2" w:semiHidden="1" w:unhideWhenUsed="1"/>
+    <w:lsdException w:name="Table Grid 3" w:semiHidden="1" w:unhideWhenUsed="1"/>
+    <w:lsdException w:name="Table Grid 4" w:semiHidden="1" w:unhideWhenUsed="1"/>
+    <w:lsdException w:name="Table Grid 5" w:semiHidden="1" w:unhideWhenUsed="1"/>
+    <w:lsdException w:name="Table Grid 6" w:semiHidden="1" w:unhideWhenUsed="1"/>
+    <w:lsdException w:name="Table Grid 7" w:semiHidden="1" w:unhideWhenUsed="1"/>
+    <w:lsdException w:name="Table Grid 8" w:semiHidden="1" w:unhideWhenUsed="1"/>
+    <w:lsdException w:name="Table List 1" w:semiHidden="1" w:unhideWhenUsed="1"/>
+    <w:lsdException w:name="Table List 2" w:semiHidden="1" w:unhideWhenUsed="1"/>
+    <w:lsdException w:name="Table List 3" w:semiHidden="1" w:unhideWhenUsed="1"/>
+    <w:lsdException w:name="Table List 4" w:semiHidden="1" w:unhideWhenUsed="1"/>
+    <w:lsdException w:name="Table List 5" w:semiHidden="1" w:unhideWhenUsed="1"/>
+    <w:lsdException w:name="Table List 6" w:semiHidden="1" w:unhideWhenUsed="1"/>
+    <w:lsdException w:name="Table List 7" w:semiHidden="1" w:unhideWhenUsed="1"/>
+    <w:lsdException w:name="Table List 8" w:semiHidden="1" w:unhideWhenUsed="1"/>
+    <w:lsdException w:name="Table 3D effects 1" w:semiHidden="1" w:unhideWhenUsed="1"/>
+    <w:lsdException w:name="Table 3D effects 2" w:semiHidden="1" w:unhideWhenUsed="1"/>
+    <w:lsdException w:name="Table 3D effects 3" w:semiHidden="1" w:unhideWhenUsed="1"/>
+    <w:lsdException w:name="Table Contemporary" w:semiHidden="1" w:unhideWhenUsed="1"/>
+    <w:lsdException w:name="Table Elegant" w:semiHidden="1" w:unhideWhenUsed="1"/>
+    <w:lsdException w:name="Table Professional" w:semiHidden="1" w:unhideWhenUsed="1"/>
+    <w:lsdException w:name="Table Subtle 1" w:semiHidden="1" w:unhideWhenUsed="1"/>
+    <w:lsdException w:name="Table Subtle 2" w:semiHidden="1" w:unhideWhenUsed="1"/>
+    <w:lsdException w:name="Table Web 1" w:semiHidden="1" w:unhideWhenUsed="1"/>
+    <w:lsdException w:name="Table Web 2" w:semiHidden="1" w:unhideWhenUsed="1"/>
+    <w:lsdException w:name="Table Web 3" w:semiHidden="1" w:unhideWhenUsed="1"/>
+    <w:lsdException w:name="Table Theme" w:semiHidden="1" w:unhideWhenUsed="1"/>
     <w:lsdException w:name="Placeholder Text" w:semiHidden="1" w:uiPriority="99"/>
     <w:lsdException w:name="No Spacing" w:uiPriority="1" w:qFormat="1"/>
     <w:lsdException w:name="Light Shading" w:uiPriority="60"/>
@@ -10312,11 +10800,15 @@
   </w:style>
   <w:style w:type="character" w:default="1" w:styleId="a0">
     <w:name w:val="Default Paragraph Font"/>
+    <w:uiPriority w:val="1"/>
     <w:semiHidden/>
+    <w:unhideWhenUsed/>
   </w:style>
   <w:style w:type="table" w:default="1" w:styleId="a1">
     <w:name w:val="Normal Table"/>
+    <w:uiPriority w:val="99"/>
     <w:semiHidden/>
+    <w:unhideWhenUsed/>
     <w:tblPr>
       <w:tblInd w:w="0" w:type="dxa"/>
       <w:tblCellMar>
@@ -10329,7 +10821,9 @@
   </w:style>
   <w:style w:type="numbering" w:default="1" w:styleId="a2">
     <w:name w:val="No List"/>
+    <w:uiPriority w:val="99"/>
     <w:semiHidden/>
+    <w:unhideWhenUsed/>
   </w:style>
   <w:style w:type="paragraph" w:customStyle="1" w:styleId="BalloonText2">
     <w:name w:val="Balloon Text2"/>
@@ -10347,8 +10841,8 @@
       <w:sz w:val="16"/>
     </w:rPr>
   </w:style>
-  <w:style w:type="paragraph" w:customStyle="1" w:styleId="BalloonText">
-    <w:name w:val="Balloon Text"/>
+  <w:style w:type="paragraph" w:customStyle="1" w:styleId="10">
+    <w:name w:val="Текст выноски1"/>
     <w:basedOn w:val="a"/>
     <w:semiHidden/>
     <w:rPr>

</xml_diff>

<commit_message>
feat(notifications): enhance accountant workflows, fix notification deep-linking, add warehouse sum export
</commit_message>
<xml_diff>
--- a/public/templates/template_smr.docx
+++ b/public/templates/template_smr.docx
@@ -1275,18 +1275,32 @@
             <w:pPr>
               <w:rPr>
                 <w:bCs/>
-                <w:lang w:val="kk-KZ"/>
-              </w:rPr>
-            </w:pPr>
-            <w:r>
+              </w:rPr>
+            </w:pPr>
+            <w:r>
+              <w:rPr>
+                <w:color w:val="000000"/>
+                <w:szCs w:val="24"/>
+                <w:lang w:val="en-US" w:eastAsia="ru-RU"/>
+              </w:rPr>
               <w:t>{</w:t>
             </w:r>
             <w:proofErr w:type="spellStart"/>
             <w:r>
-              <w:t>sender_name</w:t>
+              <w:rPr>
+                <w:color w:val="000000"/>
+                <w:szCs w:val="24"/>
+                <w:lang w:val="en-US" w:eastAsia="ru-RU"/>
+              </w:rPr>
+              <w:t>smr_sender</w:t>
             </w:r>
             <w:proofErr w:type="spellEnd"/>
             <w:r>
+              <w:rPr>
+                <w:color w:val="000000"/>
+                <w:szCs w:val="24"/>
+                <w:lang w:val="en-US" w:eastAsia="ru-RU"/>
+              </w:rPr>
               <w:t>}</w:t>
             </w:r>
           </w:p>
@@ -1311,7 +1325,7 @@
                 <w:rFonts w:ascii="Arial" w:hAnsi="Arial"/>
                 <w:color w:val="FF0000"/>
                 <w:sz w:val="14"/>
-                <w:lang w:val="en-US"/>
+                <w:lang w:val="ru-RU"/>
               </w:rPr>
             </w:pPr>
             <w:r>
@@ -1319,7 +1333,7 @@
                 <w:rFonts w:ascii="Arial" w:hAnsi="Arial"/>
                 <w:color w:val="FF0000"/>
                 <w:sz w:val="14"/>
-                <w:lang w:val="en-US"/>
+                <w:lang w:val="ru-RU"/>
               </w:rPr>
               <w:tab/>
             </w:r>
@@ -1346,35 +1360,9 @@
               <w:rPr>
                 <w:rFonts w:eastAsia="Calibri"/>
                 <w:bCs/>
-                <w:lang w:val="en-US" w:eastAsia="en-US"/>
-              </w:rPr>
-            </w:pPr>
-            <w:r>
-              <w:rPr>
-                <w:rFonts w:eastAsia="Calibri"/>
-                <w:bCs/>
-                <w:lang w:val="en-US" w:eastAsia="en-US"/>
-              </w:rPr>
-              <w:t>{</w:t>
-            </w:r>
-            <w:proofErr w:type="spellStart"/>
-            <w:r>
-              <w:rPr>
-                <w:rFonts w:eastAsia="Calibri"/>
-                <w:bCs/>
-                <w:lang w:val="en-US" w:eastAsia="en-US"/>
-              </w:rPr>
-              <w:t>sender_address</w:t>
-            </w:r>
-            <w:proofErr w:type="spellEnd"/>
-            <w:r>
-              <w:rPr>
-                <w:rFonts w:eastAsia="Calibri"/>
-                <w:bCs/>
-                <w:lang w:val="en-US" w:eastAsia="en-US"/>
-              </w:rPr>
-              <w:t>}</w:t>
-            </w:r>
+                <w:lang w:val="ru-RU" w:eastAsia="en-US"/>
+              </w:rPr>
+            </w:pPr>
           </w:p>
         </w:tc>
         <w:tc>
@@ -1420,32 +1408,6 @@
                 <w:lang w:val="ru-RU"/>
               </w:rPr>
             </w:pPr>
-            <w:r>
-              <w:rPr>
-                <w:rFonts w:eastAsia="Calibri"/>
-                <w:bCs/>
-                <w:lang w:eastAsia="en-US"/>
-              </w:rPr>
-              <w:t>{</w:t>
-            </w:r>
-            <w:proofErr w:type="spellStart"/>
-            <w:r>
-              <w:rPr>
-                <w:rFonts w:eastAsia="Calibri"/>
-                <w:bCs/>
-                <w:lang w:eastAsia="en-US"/>
-              </w:rPr>
-              <w:t>sender_bin</w:t>
-            </w:r>
-            <w:proofErr w:type="spellEnd"/>
-            <w:r>
-              <w:rPr>
-                <w:rFonts w:eastAsia="Calibri"/>
-                <w:bCs/>
-                <w:lang w:eastAsia="en-US"/>
-              </w:rPr>
-              <w:t>}</w:t>
-            </w:r>
           </w:p>
         </w:tc>
         <w:tc>
@@ -1496,32 +1458,6 @@
                 <w:lang w:val="en-US" w:eastAsia="ru-RU"/>
               </w:rPr>
             </w:pPr>
-            <w:r>
-              <w:rPr>
-                <w:color w:val="000000"/>
-                <w:szCs w:val="24"/>
-                <w:lang w:val="en-US" w:eastAsia="ru-RU"/>
-              </w:rPr>
-              <w:t>{</w:t>
-            </w:r>
-            <w:proofErr w:type="spellStart"/>
-            <w:r>
-              <w:rPr>
-                <w:color w:val="000000"/>
-                <w:szCs w:val="24"/>
-                <w:lang w:val="en-US" w:eastAsia="ru-RU"/>
-              </w:rPr>
-              <w:t>smr_sender</w:t>
-            </w:r>
-            <w:proofErr w:type="spellEnd"/>
-            <w:r>
-              <w:rPr>
-                <w:color w:val="000000"/>
-                <w:szCs w:val="24"/>
-                <w:lang w:val="en-US" w:eastAsia="ru-RU"/>
-              </w:rPr>
-              <w:t>}</w:t>
-            </w:r>
           </w:p>
         </w:tc>
         <w:tc>
@@ -2092,9 +2028,39 @@
             <w:pPr>
               <w:rPr>
                 <w:bCs/>
-                <w:lang w:val="ru-RU"/>
-              </w:rPr>
-            </w:pPr>
+                <w:lang w:val="en-US"/>
+              </w:rPr>
+            </w:pPr>
+            <w:r>
+              <w:rPr>
+                <w:bCs/>
+                <w:lang w:val="en-US"/>
+              </w:rPr>
+              <w:t>{</w:t>
+            </w:r>
+            <w:proofErr w:type="spellStart"/>
+            <w:r>
+              <w:rPr>
+                <w:bCs/>
+                <w:lang w:val="en-US"/>
+              </w:rPr>
+              <w:t>expeditor_</w:t>
+            </w:r>
+            <w:r>
+              <w:rPr>
+                <w:bCs/>
+                <w:lang w:val="en-US"/>
+              </w:rPr>
+              <w:t>name</w:t>
+            </w:r>
+            <w:proofErr w:type="spellEnd"/>
+            <w:r>
+              <w:rPr>
+                <w:bCs/>
+                <w:lang w:val="en-US"/>
+              </w:rPr>
+              <w:t>}</w:t>
+            </w:r>
           </w:p>
         </w:tc>
       </w:tr>
@@ -2158,9 +2124,35 @@
               <w:rPr>
                 <w:bCs/>
                 <w:szCs w:val="18"/>
-                <w:lang w:val="ru-RU"/>
-              </w:rPr>
-            </w:pPr>
+                <w:lang w:val="en-US"/>
+              </w:rPr>
+            </w:pPr>
+            <w:r>
+              <w:rPr>
+                <w:bCs/>
+                <w:szCs w:val="18"/>
+                <w:lang w:val="en-US"/>
+              </w:rPr>
+              <w:t>{</w:t>
+            </w:r>
+            <w:proofErr w:type="spellStart"/>
+            <w:r>
+              <w:rPr>
+                <w:bCs/>
+                <w:szCs w:val="18"/>
+                <w:lang w:val="en-US"/>
+              </w:rPr>
+              <w:t>expeditor_address</w:t>
+            </w:r>
+            <w:proofErr w:type="spellEnd"/>
+            <w:r>
+              <w:rPr>
+                <w:bCs/>
+                <w:szCs w:val="18"/>
+                <w:lang w:val="en-US"/>
+              </w:rPr>
+              <w:t>}</w:t>
+            </w:r>
           </w:p>
         </w:tc>
       </w:tr>
@@ -2187,6 +2179,13 @@
             <w:r>
               <w:rPr>
                 <w:bCs/>
+                <w:lang w:val="kk-KZ"/>
+              </w:rPr>
+              <w:t xml:space="preserve">БИН </w:t>
+            </w:r>
+            <w:r>
+              <w:rPr>
+                <w:bCs/>
                 <w:lang w:val="en-US"/>
               </w:rPr>
               <w:t>{</w:t>
@@ -2225,9 +2224,43 @@
               <w:rPr>
                 <w:bCs/>
                 <w:szCs w:val="18"/>
-                <w:lang w:val="ru-RU"/>
-              </w:rPr>
-            </w:pPr>
+                <w:lang w:val="en-US"/>
+              </w:rPr>
+            </w:pPr>
+            <w:r>
+              <w:rPr>
+                <w:bCs/>
+                <w:szCs w:val="18"/>
+                <w:lang w:val="kk-KZ"/>
+              </w:rPr>
+              <w:t xml:space="preserve">БИН </w:t>
+            </w:r>
+            <w:r>
+              <w:rPr>
+                <w:bCs/>
+                <w:szCs w:val="18"/>
+                <w:lang w:val="en-US"/>
+              </w:rPr>
+              <w:t>{</w:t>
+            </w:r>
+            <w:proofErr w:type="spellStart"/>
+            <w:r>
+              <w:rPr>
+                <w:bCs/>
+                <w:szCs w:val="18"/>
+                <w:lang w:val="en-US"/>
+              </w:rPr>
+              <w:t>expeditor_bin</w:t>
+            </w:r>
+            <w:proofErr w:type="spellEnd"/>
+            <w:r>
+              <w:rPr>
+                <w:bCs/>
+                <w:szCs w:val="18"/>
+                <w:lang w:val="en-US"/>
+              </w:rPr>
+              <w:t>}</w:t>
+            </w:r>
           </w:p>
         </w:tc>
       </w:tr>
@@ -2250,29 +2283,6 @@
                 <w:lang w:val="en-US"/>
               </w:rPr>
             </w:pPr>
-            <w:r>
-              <w:rPr>
-                <w:bCs/>
-                <w:lang w:val="en-US"/>
-              </w:rPr>
-              <w:t>{</w:t>
-            </w:r>
-            <w:proofErr w:type="spellStart"/>
-            <w:r>
-              <w:rPr>
-                <w:bCs/>
-                <w:lang w:val="en-US"/>
-              </w:rPr>
-              <w:t>toCity</w:t>
-            </w:r>
-            <w:proofErr w:type="spellEnd"/>
-            <w:r>
-              <w:rPr>
-                <w:bCs/>
-                <w:lang w:val="en-US"/>
-              </w:rPr>
-              <w:t>}</w:t>
-            </w:r>
           </w:p>
         </w:tc>
         <w:tc>
@@ -2293,7 +2303,7 @@
                 <w:bCs/>
                 <w:sz w:val="18"/>
                 <w:szCs w:val="18"/>
-                <w:lang w:val="ru-RU"/>
+                <w:lang w:val="en-US"/>
               </w:rPr>
             </w:pPr>
           </w:p>
@@ -2317,7 +2327,7 @@
               <w:rPr>
                 <w:b/>
                 <w:bCs/>
-                <w:lang w:val="ru-RU"/>
+                <w:lang w:val="en-US"/>
               </w:rPr>
             </w:pPr>
           </w:p>
@@ -2341,7 +2351,7 @@
                 <w:bCs/>
                 <w:sz w:val="18"/>
                 <w:szCs w:val="18"/>
-                <w:lang w:val="ru-RU"/>
+                <w:lang w:val="en-US"/>
               </w:rPr>
             </w:pPr>
           </w:p>
@@ -9097,7 +9107,38 @@
                 <w:szCs w:val="11"/>
                 <w:lang w:val="kk-KZ"/>
               </w:rPr>
-              <w:t xml:space="preserve">     ____________________________</w:t>
+              <w:t xml:space="preserve">  </w:t>
+            </w:r>
+            <w:proofErr w:type="gramStart"/>
+            <w:r>
+              <w:rPr>
+                <w:color w:val="FF0000"/>
+                <w:sz w:val="11"/>
+                <w:szCs w:val="11"/>
+                <w:lang w:val="kk-KZ"/>
+              </w:rPr>
+              <w:t xml:space="preserve">   </w:t>
+            </w:r>
+            <w:r>
+              <w:rPr>
+                <w:color w:val="FF0000"/>
+                <w:sz w:val="11"/>
+                <w:szCs w:val="11"/>
+                <w:u w:val="single"/>
+                <w:lang w:val="en-US"/>
+              </w:rPr>
+              <w:t>{</w:t>
+            </w:r>
+            <w:proofErr w:type="gramEnd"/>
+            <w:r>
+              <w:rPr>
+                <w:color w:val="FF0000"/>
+                <w:sz w:val="11"/>
+                <w:szCs w:val="11"/>
+                <w:u w:val="single"/>
+                <w:lang w:val="en-US"/>
+              </w:rPr>
+              <w:t>driver}</w:t>
             </w:r>
           </w:p>
         </w:tc>
@@ -10116,16 +10157,22 @@
             </w:pPr>
             <w:r>
               <w:rPr>
-                <w:lang w:val="en-US"/>
-              </w:rPr>
-              <w:t>{</w:t>
+                <w:lang w:val="kk-KZ"/>
+              </w:rPr>
+              <w:t>ГРНЗ</w:t>
+            </w:r>
+            <w:r>
+              <w:rPr>
+                <w:lang w:val="en-US"/>
+              </w:rPr>
+              <w:t>: {</w:t>
             </w:r>
             <w:proofErr w:type="spellStart"/>
             <w:r>
               <w:rPr>
                 <w:lang w:val="en-US"/>
               </w:rPr>
-              <w:t>transportType</w:t>
+              <w:t>vehicle_number</w:t>
             </w:r>
             <w:proofErr w:type="spellEnd"/>
             <w:r>
@@ -10162,62 +10209,30 @@
             </w:pPr>
             <w:r>
               <w:rPr>
-                <w:szCs w:val="18"/>
-                <w:lang w:val="en-US"/>
-              </w:rPr>
-              <w:t>{#has_</w:t>
-            </w:r>
-            <w:proofErr w:type="gramStart"/>
-            <w:r>
-              <w:rPr>
-                <w:szCs w:val="18"/>
-                <w:lang w:val="en-US"/>
-              </w:rPr>
-              <w:t>trailer}</w:t>
-            </w:r>
-            <w:r>
-              <w:rPr>
-                <w:szCs w:val="18"/>
+                <w:sz w:val="22"/>
                 <w:lang w:val="kk-KZ"/>
               </w:rPr>
-              <w:t>Прицеп</w:t>
-            </w:r>
-            <w:proofErr w:type="gramEnd"/>
-            <w:r>
-              <w:rPr>
-                <w:szCs w:val="18"/>
-                <w:lang w:val="en-US"/>
-              </w:rPr>
-              <w:t>:{</w:t>
+              <w:t>Марка</w:t>
+            </w:r>
+            <w:r>
+              <w:rPr>
+                <w:sz w:val="22"/>
+                <w:lang w:val="en-US"/>
+              </w:rPr>
+              <w:t>: {</w:t>
             </w:r>
             <w:proofErr w:type="spellStart"/>
             <w:r>
               <w:rPr>
-                <w:szCs w:val="18"/>
-                <w:lang w:val="en-US"/>
-              </w:rPr>
-              <w:t>trailer_number</w:t>
+                <w:sz w:val="22"/>
+                <w:lang w:val="en-US"/>
+              </w:rPr>
+              <w:t>vehicle_model</w:t>
             </w:r>
             <w:proofErr w:type="spellEnd"/>
             <w:r>
               <w:rPr>
-                <w:szCs w:val="18"/>
-                <w:lang w:val="en-US"/>
-              </w:rPr>
-              <w:t>}{/</w:t>
-            </w:r>
-            <w:proofErr w:type="spellStart"/>
-            <w:r>
-              <w:rPr>
-                <w:szCs w:val="18"/>
-                <w:lang w:val="en-US"/>
-              </w:rPr>
-              <w:t>has_trailer</w:t>
-            </w:r>
-            <w:proofErr w:type="spellEnd"/>
-            <w:r>
-              <w:rPr>
-                <w:szCs w:val="18"/>
+                <w:sz w:val="22"/>
                 <w:lang w:val="en-US"/>
               </w:rPr>
               <w:t>}</w:t>
@@ -10266,43 +10281,100 @@
             </w:pPr>
             <w:r>
               <w:rPr>
-                <w:bCs/>
+                <w:szCs w:val="18"/>
+                <w:lang w:val="en-US"/>
+              </w:rPr>
+              <w:t>{#has_</w:t>
+            </w:r>
+            <w:proofErr w:type="gramStart"/>
+            <w:r>
+              <w:rPr>
+                <w:szCs w:val="18"/>
+                <w:lang w:val="en-US"/>
+              </w:rPr>
+              <w:t>trailer}</w:t>
+            </w:r>
+            <w:r>
+              <w:rPr>
+                <w:szCs w:val="18"/>
+                <w:lang w:val="kk-KZ"/>
+              </w:rPr>
+              <w:t>ГРНЗ</w:t>
+            </w:r>
+            <w:proofErr w:type="gramEnd"/>
+            <w:r>
+              <w:rPr>
+                <w:szCs w:val="18"/>
+                <w:lang w:val="kk-KZ"/>
+              </w:rPr>
+              <w:t xml:space="preserve"> п</w:t>
+            </w:r>
+            <w:r>
+              <w:rPr>
+                <w:szCs w:val="18"/>
+                <w:lang w:val="kk-KZ"/>
+              </w:rPr>
+              <w:t>рице</w:t>
+            </w:r>
+            <w:r>
+              <w:rPr>
+                <w:szCs w:val="18"/>
+                <w:lang w:val="kk-KZ"/>
+              </w:rPr>
+              <w:t>па</w:t>
+            </w:r>
+            <w:r>
+              <w:rPr>
+                <w:szCs w:val="18"/>
+                <w:lang w:val="en-US"/>
+              </w:rPr>
+              <w:t>:</w:t>
+            </w:r>
+            <w:r>
+              <w:rPr>
+                <w:szCs w:val="18"/>
+                <w:lang w:val="en-US"/>
+              </w:rPr>
+              <w:t xml:space="preserve"> </w:t>
+            </w:r>
+            <w:r>
+              <w:rPr>
+                <w:szCs w:val="18"/>
+                <w:lang w:val="en-US"/>
               </w:rPr>
               <w:t>{</w:t>
             </w:r>
             <w:proofErr w:type="spellStart"/>
             <w:r>
               <w:rPr>
-                <w:bCs/>
-              </w:rPr>
-              <w:t>vehicle</w:t>
+                <w:szCs w:val="18"/>
+                <w:lang w:val="en-US"/>
+              </w:rPr>
+              <w:t>trailer_number</w:t>
             </w:r>
             <w:proofErr w:type="spellEnd"/>
             <w:r>
               <w:rPr>
-                <w:bCs/>
-              </w:rPr>
-              <w:t>} {</w:t>
+                <w:szCs w:val="18"/>
+                <w:lang w:val="en-US"/>
+              </w:rPr>
+              <w:t>}{/</w:t>
             </w:r>
             <w:proofErr w:type="spellStart"/>
             <w:r>
               <w:rPr>
-                <w:bCs/>
-              </w:rPr>
-              <w:t>driver</w:t>
+                <w:szCs w:val="18"/>
+                <w:lang w:val="en-US"/>
+              </w:rPr>
+              <w:t>has_trailer</w:t>
             </w:r>
             <w:proofErr w:type="spellEnd"/>
             <w:r>
               <w:rPr>
-                <w:bCs/>
+                <w:szCs w:val="18"/>
+                <w:lang w:val="en-US"/>
               </w:rPr>
               <w:t>}</w:t>
-            </w:r>
-            <w:r>
-              <w:rPr>
-                <w:b/>
-              </w:rPr>
-              <w:t xml:space="preserve"> </w:t>
             </w:r>
           </w:p>
         </w:tc>
@@ -10325,6 +10397,96 @@
                 <w:lang w:val="kk-KZ"/>
               </w:rPr>
             </w:pPr>
+            <w:r>
+              <w:rPr>
+                <w:szCs w:val="18"/>
+                <w:lang w:val="en-US"/>
+              </w:rPr>
+              <w:t>{#has_</w:t>
+            </w:r>
+            <w:proofErr w:type="gramStart"/>
+            <w:r>
+              <w:rPr>
+                <w:szCs w:val="18"/>
+                <w:lang w:val="en-US"/>
+              </w:rPr>
+              <w:t>trailer}</w:t>
+            </w:r>
+            <w:r>
+              <w:rPr>
+                <w:szCs w:val="18"/>
+                <w:lang w:val="kk-KZ"/>
+              </w:rPr>
+              <w:t>Марка</w:t>
+            </w:r>
+            <w:proofErr w:type="gramEnd"/>
+            <w:r>
+              <w:rPr>
+                <w:szCs w:val="18"/>
+                <w:lang w:val="kk-KZ"/>
+              </w:rPr>
+              <w:t xml:space="preserve"> прицепа</w:t>
+            </w:r>
+            <w:r>
+              <w:rPr>
+                <w:szCs w:val="18"/>
+                <w:lang w:val="en-US"/>
+              </w:rPr>
+              <w:t>:</w:t>
+            </w:r>
+            <w:r>
+              <w:rPr>
+                <w:szCs w:val="18"/>
+                <w:lang w:val="en-US"/>
+              </w:rPr>
+              <w:t xml:space="preserve"> </w:t>
+            </w:r>
+            <w:r>
+              <w:rPr>
+                <w:szCs w:val="18"/>
+                <w:lang w:val="en-US"/>
+              </w:rPr>
+              <w:t>{</w:t>
+            </w:r>
+            <w:proofErr w:type="spellStart"/>
+            <w:r>
+              <w:rPr>
+                <w:szCs w:val="18"/>
+                <w:lang w:val="en-US"/>
+              </w:rPr>
+              <w:t>trailer</w:t>
+            </w:r>
+            <w:r>
+              <w:rPr>
+                <w:szCs w:val="18"/>
+                <w:lang w:val="en-US"/>
+              </w:rPr>
+              <w:t>_model</w:t>
+            </w:r>
+            <w:proofErr w:type="spellEnd"/>
+            <w:r>
+              <w:rPr>
+                <w:szCs w:val="18"/>
+                <w:lang w:val="en-US"/>
+              </w:rPr>
+              <w:t>}{/</w:t>
+            </w:r>
+            <w:proofErr w:type="spellStart"/>
+            <w:r>
+              <w:rPr>
+                <w:szCs w:val="18"/>
+                <w:lang w:val="en-US"/>
+              </w:rPr>
+              <w:t>has_trailer</w:t>
+            </w:r>
+            <w:proofErr w:type="spellEnd"/>
+            <w:r>
+              <w:rPr>
+                <w:szCs w:val="18"/>
+                <w:lang w:val="en-US"/>
+              </w:rPr>
+              <w:t>}</w:t>
+            </w:r>
           </w:p>
         </w:tc>
         <w:tc>

</xml_diff>